<commit_message>
Publicar sitio (matriz + calculadora de zapatas) 45cd86910309879a03f3b9929d819e255e71250a
</commit_message>
<xml_diff>
--- a/entregables/Matriz-Contenido-Septiembre-2026-DMA.docx
+++ b/entregables/Matriz-Contenido-Septiembre-2026-DMA.docx
@@ -1946,7 +1946,7 @@
           <w:sz w:val="21"/>
           <w:szCs w:val="21"/>
         </w:rPr>
-        <w:t xml:space="preserve">FEED PRINCIPAL: las 12 piezas BASE mantienen el 40/40/20 exacto — 5 reels, 5 carruseles y 2 posts planos, lunes / miercoles / viernes. Encima van 3 EXTRAS los martes 8, 22 y 29: el lanzamiento de cada recurso gratuito, y desde el 9-sep los tres son REEL. Total del mes: 15 piezas de feed (8 reels, 5 carruseles, 2 posts planos). CORREGIDO 9-sep: esta regla decia que los extras eran «los 5 reels ya grabados» — eran los de agosto, que se retiraron el 8-sep. Ninguno de los 5 reels de valor esta grabado: los cinco son nuevos y estan POR GRABAR.</w:t>
+        <w:t xml:space="preserve">FEED PRINCIPAL: las 12 piezas BASE mantienen el 40/40/20 exacto — 5 reels, 5 carruseles y 2 posts planos, lunes / miercoles / viernes. Todo lo de lead magnet va ENCIMA, sin tocar esas doce. Cada recurso gratuito lleva DOS piezas: el reel el martes (8, 22 y 29) y el carrusel o post plano el jueves siguiente (10, 24 y 1 oct). Seis extras en total. POR QUE DOS DIAS DE DISTANCIA y no el mismo dia: el reel trae alcance y el carrusel trae guardados, y publicados a la vez compiten entre ellos por la misma audiencia en las mismas horas. Separados, la palabra clave se pide DOS veces en la misma semana. Total del mes: 18 piezas de feed (8 reels, 7 carruseles, 3 posts planos). CORREGIDO 9-sep: esta regla decia que los extras eran «los 5 reels ya grabados» — eran los de agosto, que se retiraron el 8-sep. Ninguno de los 5 reels de valor esta grabado.</w:t>
       </w:r>
     </w:p>
     <w:p>
@@ -24454,6 +24454,798 @@
     </w:p>
     <w:p>
       <w:pPr>
+        <w:spacing w:after="80" w:before="200"/>
+      </w:pPr>
+      <w:r>
+        <w:rPr>
+          <w:b/>
+          <w:bCs/>
+          <w:color w:val="0E2438"/>
+          <w:sz w:val="22"/>
+          <w:szCs w:val="22"/>
+        </w:rPr>
+        <w:t xml:space="preserve">Post de lanzamiento · Jue 10 · CARRUSEL (7 slides) — EXTRA de lanzamiento</w:t>
+      </w:r>
+    </w:p>
+    <w:p>
+      <w:pPr>
+        <w:spacing w:after="80"/>
+        <w:rPr>
+          <w:i/>
+          <w:iCs/>
+          <w:color w:val="5A6B7B"/>
+        </w:rPr>
+      </w:pPr>
+      <w:r>
+        <w:rPr>
+          <w:i/>
+          <w:iCs/>
+          <w:color w:val="5A6B7B"/>
+          <w:sz w:val="21"/>
+          <w:szCs w:val="21"/>
+        </w:rPr>
+        <w:t xml:space="preserve">Redes: Instagram + Facebook + LinkedIn (PDF)</w:t>
+      </w:r>
+    </w:p>
+    <w:p>
+      <w:pPr>
+        <w:pBdr>
+          <w:left w:val="single" w:color="C96A1C" w:sz="18" w:space="8"/>
+        </w:pBdr>
+        <w:shd w:fill="F4F7FA" w:val="clear"/>
+        <w:spacing w:after="100"/>
+      </w:pPr>
+      <w:r>
+        <w:rPr>
+          <w:i/>
+          <w:iCs/>
+          <w:color w:val="5A6B7B"/>
+          <w:sz w:val="20"/>
+          <w:szCs w:val="20"/>
+        </w:rPr>
+        <w:t xml:space="preserve">Segunda pieza del mismo recurso, dos días después del reel. El reel da alcance y el carrusel da guardados, que es donde vive este contenido: un error de Revit se guarda para cuando vuelva a pasar. Y son dos ventanas de comentarios para la misma palabra en vez de una.</w:t>
+      </w:r>
+    </w:p>
+    <w:p>
+      <w:pPr>
+        <w:pBdr>
+          <w:left w:val="single" w:color="B9C6D3" w:sz="14" w:space="8"/>
+        </w:pBdr>
+        <w:shd w:fill="F7F9FB" w:val="clear"/>
+        <w:spacing w:after="140"/>
+      </w:pPr>
+      <w:r>
+        <w:rPr>
+          <w:rFonts w:ascii="Consolas" w:cs="Consolas" w:eastAsia="Consolas" w:hAnsi="Consolas"/>
+          <w:sz w:val="18"/>
+          <w:szCs w:val="18"/>
+        </w:rPr>
+        <w:t xml:space="preserve">El mensaje de error de Revit casi nunca dice cuál es el problema.</w:t>
+      </w:r>
+    </w:p>
+    <w:p>
+      <w:pPr>
+        <w:spacing w:after="80"/>
+        <w:rPr>
+          <w:b/>
+          <w:bCs/>
+          <w:color w:val="5A6B7B"/>
+          <w:sz w:val="16"/>
+          <w:szCs w:val="16"/>
+        </w:rPr>
+      </w:pPr>
+      <w:r>
+        <w:rPr>
+          <w:b/>
+          <w:bCs/>
+          <w:color w:val="5A6B7B"/>
+          <w:sz w:val="16"/>
+          <w:szCs w:val="16"/>
+        </w:rPr>
+        <w:t xml:space="preserve">DIAPOSITIVAS</w:t>
+      </w:r>
+    </w:p>
+    <w:tbl>
+      <w:tblPr>
+        <w:tblW w:type="dxa" w:w="9000"/>
+        <w:tblBorders>
+          <w:top w:val="single" w:color="auto" w:sz="4"/>
+          <w:left w:val="single" w:color="auto" w:sz="4"/>
+          <w:bottom w:val="single" w:color="auto" w:sz="4"/>
+          <w:right w:val="single" w:color="auto" w:sz="4"/>
+          <w:insideH w:val="single" w:color="auto" w:sz="4"/>
+          <w:insideV w:val="single" w:color="auto" w:sz="4"/>
+        </w:tblBorders>
+      </w:tblPr>
+      <w:tblGrid>
+        <w:gridCol w:w="600"/>
+        <w:gridCol w:w="8400"/>
+      </w:tblGrid>
+      <w:tr>
+        <w:trPr>
+          <w:tblHeader/>
+        </w:trPr>
+        <w:tc>
+          <w:tcPr>
+            <w:tcW w:type="dxa" w:w="600"/>
+            <w:shd w:fill="0E2438" w:val="clear"/>
+          </w:tcPr>
+          <w:p>
+            <w:r>
+              <w:rPr>
+                <w:b/>
+                <w:bCs/>
+                <w:color w:val="FFFFFF"/>
+                <w:sz w:val="18"/>
+                <w:szCs w:val="18"/>
+              </w:rPr>
+              <w:t xml:space="preserve">#</w:t>
+            </w:r>
+          </w:p>
+        </w:tc>
+        <w:tc>
+          <w:tcPr>
+            <w:tcW w:type="dxa" w:w="8400"/>
+            <w:shd w:fill="0E2438" w:val="clear"/>
+          </w:tcPr>
+          <w:p>
+            <w:r>
+              <w:rPr>
+                <w:b/>
+                <w:bCs/>
+                <w:color w:val="FFFFFF"/>
+                <w:sz w:val="18"/>
+                <w:szCs w:val="18"/>
+              </w:rPr>
+              <w:t xml:space="preserve">Qué va en la diapositiva</w:t>
+            </w:r>
+          </w:p>
+        </w:tc>
+      </w:tr>
+      <w:tr>
+        <w:tc>
+          <w:tcPr>
+            <w:tcW w:type="dxa" w:w="600"/>
+          </w:tcPr>
+          <w:p>
+            <w:r>
+              <w:rPr>
+                <w:sz w:val="18"/>
+                <w:szCs w:val="18"/>
+              </w:rPr>
+              <w:t xml:space="preserve">1</w:t>
+            </w:r>
+          </w:p>
+        </w:tc>
+        <w:tc>
+          <w:tcPr>
+            <w:tcW w:type="dxa" w:w="8400"/>
+          </w:tcPr>
+          <w:p>
+            <w:r>
+              <w:rPr>
+                <w:sz w:val="18"/>
+                <w:szCs w:val="18"/>
+              </w:rPr>
+              <w:t xml:space="preserve">1 · EL MENSAJE DE ERROR TE ESTÁ DICIENDO OTRA COSA. Cinco de los diez que más tiempo hacen perder, y qué significan de verdad.</w:t>
+            </w:r>
+          </w:p>
+        </w:tc>
+      </w:tr>
+      <w:tr>
+        <w:tc>
+          <w:tcPr>
+            <w:tcW w:type="dxa" w:w="600"/>
+          </w:tcPr>
+          <w:p>
+            <w:r>
+              <w:rPr>
+                <w:sz w:val="18"/>
+                <w:szCs w:val="18"/>
+              </w:rPr>
+              <w:t xml:space="preserve">2</w:t>
+            </w:r>
+          </w:p>
+        </w:tc>
+        <w:tc>
+          <w:tcPr>
+            <w:tcW w:type="dxa" w:w="8400"/>
+          </w:tcPr>
+          <w:p>
+            <w:r>
+              <w:rPr>
+                <w:sz w:val="18"/>
+                <w:szCs w:val="18"/>
+              </w:rPr>
+              <w:t xml:space="preserve">2 · «No aparece en la vista» — y el elemento SÍ está. Es el que más tiempo hace perder de toda la lista, y casi nunca es un error: el elemento existe, pero la vista está configurada para no mostrarlo.</w:t>
+            </w:r>
+          </w:p>
+        </w:tc>
+      </w:tr>
+      <w:tr>
+        <w:tc>
+          <w:tcPr>
+            <w:tcW w:type="dxa" w:w="600"/>
+          </w:tcPr>
+          <w:p>
+            <w:r>
+              <w:rPr>
+                <w:sz w:val="18"/>
+                <w:szCs w:val="18"/>
+              </w:rPr>
+              <w:t xml:space="preserve">3</w:t>
+            </w:r>
+          </w:p>
+        </w:tc>
+        <w:tc>
+          <w:tcPr>
+            <w:tcW w:type="dxa" w:w="8400"/>
+          </w:tcPr>
+          <w:p>
+            <w:r>
+              <w:rPr>
+                <w:sz w:val="18"/>
+                <w:szCs w:val="18"/>
+              </w:rPr>
+              <w:t xml:space="preserve">3 · «Highlighted walls overlap». Dos muros ocupando el mismo espacio. Revit sigue trabajando, pero al calcular áreas de habitación va a ignorar uno de los dos — y el cuadro de áreas sale mal SIN AVISAR.</w:t>
+            </w:r>
+          </w:p>
+        </w:tc>
+      </w:tr>
+      <w:tr>
+        <w:tc>
+          <w:tcPr>
+            <w:tcW w:type="dxa" w:w="600"/>
+          </w:tcPr>
+          <w:p>
+            <w:r>
+              <w:rPr>
+                <w:sz w:val="18"/>
+                <w:szCs w:val="18"/>
+              </w:rPr>
+              <w:t xml:space="preserve">4</w:t>
+            </w:r>
+          </w:p>
+        </w:tc>
+        <w:tc>
+          <w:tcPr>
+            <w:tcW w:type="dxa" w:w="8400"/>
+          </w:tcPr>
+          <w:p>
+            <w:r>
+              <w:rPr>
+                <w:sz w:val="18"/>
+                <w:szCs w:val="18"/>
+              </w:rPr>
+              <w:t xml:space="preserve">4 · «There are identical instances in the same place». Dos elementos idénticos, uno exactamente encima del otro. Los planos se ven bien. El cuadro de cantidades cuenta el doble.</w:t>
+            </w:r>
+          </w:p>
+        </w:tc>
+      </w:tr>
+      <w:tr>
+        <w:tc>
+          <w:tcPr>
+            <w:tcW w:type="dxa" w:w="600"/>
+          </w:tcPr>
+          <w:p>
+            <w:r>
+              <w:rPr>
+                <w:sz w:val="18"/>
+                <w:szCs w:val="18"/>
+              </w:rPr>
+              <w:t xml:space="preserve">5</w:t>
+            </w:r>
+          </w:p>
+        </w:tc>
+        <w:tc>
+          <w:tcPr>
+            <w:tcW w:type="dxa" w:w="8400"/>
+          </w:tcPr>
+          <w:p>
+            <w:r>
+              <w:rPr>
+                <w:sz w:val="18"/>
+                <w:szCs w:val="18"/>
+              </w:rPr>
+              <w:t xml:space="preserve">5 · «Elements are joined but do not intersect». Siguen unidos, pero ya no se tocan: normalmente porque uno se movió después.</w:t>
+            </w:r>
+          </w:p>
+        </w:tc>
+      </w:tr>
+      <w:tr>
+        <w:tc>
+          <w:tcPr>
+            <w:tcW w:type="dxa" w:w="600"/>
+          </w:tcPr>
+          <w:p>
+            <w:r>
+              <w:rPr>
+                <w:sz w:val="18"/>
+                <w:szCs w:val="18"/>
+              </w:rPr>
+              <w:t xml:space="preserve">6</w:t>
+            </w:r>
+          </w:p>
+        </w:tc>
+        <w:tc>
+          <w:tcPr>
+            <w:tcW w:type="dxa" w:w="8400"/>
+          </w:tcPr>
+          <w:p>
+            <w:r>
+              <w:rPr>
+                <w:sz w:val="18"/>
+                <w:szCs w:val="18"/>
+              </w:rPr>
+              <w:t xml:space="preserve">6 · «The linked file could not be found». El vínculo apunta a una ruta que ya no existe. Alguien movió, renombró o guardó en otra carpeta.</w:t>
+            </w:r>
+          </w:p>
+        </w:tc>
+      </w:tr>
+      <w:tr>
+        <w:tc>
+          <w:tcPr>
+            <w:tcW w:type="dxa" w:w="600"/>
+          </w:tcPr>
+          <w:p>
+            <w:r>
+              <w:rPr>
+                <w:sz w:val="18"/>
+                <w:szCs w:val="18"/>
+              </w:rPr>
+              <w:t xml:space="preserve">7</w:t>
+            </w:r>
+          </w:p>
+        </w:tc>
+        <w:tc>
+          <w:tcPr>
+            <w:tcW w:type="dxa" w:w="8400"/>
+          </w:tcPr>
+          <w:p>
+            <w:r>
+              <w:rPr>
+                <w:sz w:val="18"/>
+                <w:szCs w:val="18"/>
+              </w:rPr>
+              <w:t xml:space="preserve">7 · Los diez, cada uno con su prompt. Y la página que importa más que las otras diez: cómo comprobar la respuesta antes de aplicarla. COMENTA GUIA.</w:t>
+            </w:r>
+          </w:p>
+        </w:tc>
+      </w:tr>
+    </w:tbl>
+    <w:p>
+      <w:pPr>
+        <w:pBdr>
+          <w:left w:val="single" w:color="B9C6D3" w:sz="14" w:space="8"/>
+        </w:pBdr>
+        <w:shd w:fill="F7F9FB" w:val="clear"/>
+        <w:spacing w:after="0"/>
+      </w:pPr>
+      <w:r>
+        <w:rPr>
+          <w:rFonts w:ascii="Consolas" w:cs="Consolas" w:eastAsia="Consolas" w:hAnsi="Consolas"/>
+          <w:sz w:val="18"/>
+          <w:szCs w:val="18"/>
+        </w:rPr>
+        <w:t xml:space="preserve">El error que te frena la tarde casi siempre está mal explicado por el propio mensaje: dice una</w:t>
+      </w:r>
+    </w:p>
+    <w:p>
+      <w:pPr>
+        <w:pBdr>
+          <w:left w:val="single" w:color="B9C6D3" w:sz="14" w:space="8"/>
+        </w:pBdr>
+        <w:shd w:fill="F7F9FB" w:val="clear"/>
+        <w:spacing w:after="0"/>
+      </w:pPr>
+      <w:r>
+        <w:rPr>
+          <w:rFonts w:ascii="Consolas" w:cs="Consolas" w:eastAsia="Consolas" w:hAnsi="Consolas"/>
+          <w:sz w:val="18"/>
+          <w:szCs w:val="18"/>
+        </w:rPr>
+        <w:t xml:space="preserve">cosa y el problema es otra.</w:t>
+      </w:r>
+    </w:p>
+    <w:p>
+      <w:pPr>
+        <w:pBdr>
+          <w:left w:val="single" w:color="B9C6D3" w:sz="14" w:space="8"/>
+        </w:pBdr>
+        <w:shd w:fill="F7F9FB" w:val="clear"/>
+        <w:spacing w:after="0"/>
+      </w:pPr>
+      <w:r>
+        <w:rPr>
+          <w:rFonts w:ascii="Consolas" w:cs="Consolas" w:eastAsia="Consolas" w:hAnsi="Consolas"/>
+          <w:sz w:val="18"/>
+          <w:szCs w:val="18"/>
+        </w:rPr>
+        <w:t xml:space="preserve"> </w:t>
+      </w:r>
+    </w:p>
+    <w:p>
+      <w:pPr>
+        <w:pBdr>
+          <w:left w:val="single" w:color="B9C6D3" w:sz="14" w:space="8"/>
+        </w:pBdr>
+        <w:shd w:fill="F7F9FB" w:val="clear"/>
+        <w:spacing w:after="0"/>
+      </w:pPr>
+      <w:r>
+        <w:rPr>
+          <w:rFonts w:ascii="Consolas" w:cs="Consolas" w:eastAsia="Consolas" w:hAnsi="Consolas"/>
+          <w:sz w:val="18"/>
+          <w:szCs w:val="18"/>
+        </w:rPr>
+        <w:t xml:space="preserve">Los dos peores no dan ningún aviso. Dos muros superpuestos hacen que el cuadro de áreas salga</w:t>
+      </w:r>
+    </w:p>
+    <w:p>
+      <w:pPr>
+        <w:pBdr>
+          <w:left w:val="single" w:color="B9C6D3" w:sz="14" w:space="8"/>
+        </w:pBdr>
+        <w:shd w:fill="F7F9FB" w:val="clear"/>
+        <w:spacing w:after="0"/>
+      </w:pPr>
+      <w:r>
+        <w:rPr>
+          <w:rFonts w:ascii="Consolas" w:cs="Consolas" w:eastAsia="Consolas" w:hAnsi="Consolas"/>
+          <w:sz w:val="18"/>
+          <w:szCs w:val="18"/>
+        </w:rPr>
+        <w:t xml:space="preserve">mal sin decírtelo, y dos elementos idénticos encima hacen que el de cantidades cuente el doble.</w:t>
+      </w:r>
+    </w:p>
+    <w:p>
+      <w:pPr>
+        <w:pBdr>
+          <w:left w:val="single" w:color="B9C6D3" w:sz="14" w:space="8"/>
+        </w:pBdr>
+        <w:shd w:fill="F7F9FB" w:val="clear"/>
+        <w:spacing w:after="0"/>
+      </w:pPr>
+      <w:r>
+        <w:rPr>
+          <w:rFonts w:ascii="Consolas" w:cs="Consolas" w:eastAsia="Consolas" w:hAnsi="Consolas"/>
+          <w:sz w:val="18"/>
+          <w:szCs w:val="18"/>
+        </w:rPr>
+        <w:t xml:space="preserve">Los planos, mientras tanto, se ven perfectos.</w:t>
+      </w:r>
+    </w:p>
+    <w:p>
+      <w:pPr>
+        <w:pBdr>
+          <w:left w:val="single" w:color="B9C6D3" w:sz="14" w:space="8"/>
+        </w:pBdr>
+        <w:shd w:fill="F7F9FB" w:val="clear"/>
+        <w:spacing w:after="0"/>
+      </w:pPr>
+      <w:r>
+        <w:rPr>
+          <w:rFonts w:ascii="Consolas" w:cs="Consolas" w:eastAsia="Consolas" w:hAnsi="Consolas"/>
+          <w:sz w:val="18"/>
+          <w:szCs w:val="18"/>
+        </w:rPr>
+        <w:t xml:space="preserve"> </w:t>
+      </w:r>
+    </w:p>
+    <w:p>
+      <w:pPr>
+        <w:pBdr>
+          <w:left w:val="single" w:color="B9C6D3" w:sz="14" w:space="8"/>
+        </w:pBdr>
+        <w:shd w:fill="F7F9FB" w:val="clear"/>
+        <w:spacing w:after="0"/>
+      </w:pPr>
+      <w:r>
+        <w:rPr>
+          <w:rFonts w:ascii="Consolas" w:cs="Consolas" w:eastAsia="Consolas" w:hAnsi="Consolas"/>
+          <w:sz w:val="18"/>
+          <w:szCs w:val="18"/>
+        </w:rPr>
+        <w:t xml:space="preserve">Junté los 10 que más tiempo hacen perder, con el prompt exacto para cada uno y cómo verificar</w:t>
+      </w:r>
+    </w:p>
+    <w:p>
+      <w:pPr>
+        <w:pBdr>
+          <w:left w:val="single" w:color="B9C6D3" w:sz="14" w:space="8"/>
+        </w:pBdr>
+        <w:shd w:fill="F7F9FB" w:val="clear"/>
+        <w:spacing w:after="0"/>
+      </w:pPr>
+      <w:r>
+        <w:rPr>
+          <w:rFonts w:ascii="Consolas" w:cs="Consolas" w:eastAsia="Consolas" w:hAnsi="Consolas"/>
+          <w:sz w:val="18"/>
+          <w:szCs w:val="18"/>
+        </w:rPr>
+        <w:t xml:space="preserve">la respuesta antes de meterla en un modelo que vas a firmar.</w:t>
+      </w:r>
+    </w:p>
+    <w:p>
+      <w:pPr>
+        <w:pBdr>
+          <w:left w:val="single" w:color="B9C6D3" w:sz="14" w:space="8"/>
+        </w:pBdr>
+        <w:shd w:fill="F7F9FB" w:val="clear"/>
+        <w:spacing w:after="0"/>
+      </w:pPr>
+      <w:r>
+        <w:rPr>
+          <w:rFonts w:ascii="Consolas" w:cs="Consolas" w:eastAsia="Consolas" w:hAnsi="Consolas"/>
+          <w:sz w:val="18"/>
+          <w:szCs w:val="18"/>
+        </w:rPr>
+        <w:t xml:space="preserve"> </w:t>
+      </w:r>
+    </w:p>
+    <w:p>
+      <w:pPr>
+        <w:pBdr>
+          <w:left w:val="single" w:color="B9C6D3" w:sz="14" w:space="8"/>
+        </w:pBdr>
+        <w:shd w:fill="F7F9FB" w:val="clear"/>
+        <w:spacing w:after="0"/>
+      </w:pPr>
+      <w:r>
+        <w:rPr>
+          <w:rFonts w:ascii="Consolas" w:cs="Consolas" w:eastAsia="Consolas" w:hAnsi="Consolas"/>
+          <w:sz w:val="18"/>
+          <w:szCs w:val="18"/>
+        </w:rPr>
+        <w:t xml:space="preserve">Es gratis. Comenta GUIA y te llega.</w:t>
+      </w:r>
+    </w:p>
+    <w:p>
+      <w:pPr>
+        <w:pBdr>
+          <w:left w:val="single" w:color="B9C6D3" w:sz="14" w:space="8"/>
+        </w:pBdr>
+        <w:shd w:fill="F7F9FB" w:val="clear"/>
+        <w:spacing w:after="0"/>
+      </w:pPr>
+      <w:r>
+        <w:rPr>
+          <w:rFonts w:ascii="Consolas" w:cs="Consolas" w:eastAsia="Consolas" w:hAnsi="Consolas"/>
+          <w:sz w:val="18"/>
+          <w:szCs w:val="18"/>
+        </w:rPr>
+        <w:t xml:space="preserve"> </w:t>
+      </w:r>
+    </w:p>
+    <w:p>
+      <w:pPr>
+        <w:pBdr>
+          <w:left w:val="single" w:color="B9C6D3" w:sz="14" w:space="8"/>
+        </w:pBdr>
+        <w:shd w:fill="F7F9FB" w:val="clear"/>
+        <w:spacing w:after="140"/>
+      </w:pPr>
+      <w:r>
+        <w:rPr>
+          <w:rFonts w:ascii="Consolas" w:cs="Consolas" w:eastAsia="Consolas" w:hAnsi="Consolas"/>
+          <w:sz w:val="18"/>
+          <w:szCs w:val="18"/>
+        </w:rPr>
+        <w:t xml:space="preserve">¿Cuál de los cinco te ha tocado más veces?</w:t>
+      </w:r>
+    </w:p>
+    <w:p>
+      <w:pPr>
+        <w:spacing w:after="80"/>
+        <w:rPr>
+          <w:b/>
+          <w:bCs/>
+        </w:rPr>
+      </w:pPr>
+      <w:r>
+        <w:rPr>
+          <w:b/>
+          <w:bCs/>
+          <w:sz w:val="21"/>
+          <w:szCs w:val="21"/>
+        </w:rPr>
+        <w:t xml:space="preserve">CTA: Comenta GUIA</w:t>
+      </w:r>
+    </w:p>
+    <w:p>
+      <w:pPr>
+        <w:spacing w:after="80"/>
+        <w:rPr>
+          <w:b/>
+          <w:bCs/>
+          <w:color w:val="5A6B7B"/>
+          <w:sz w:val="16"/>
+          <w:szCs w:val="16"/>
+        </w:rPr>
+      </w:pPr>
+      <w:r>
+        <w:rPr>
+          <w:b/>
+          <w:bCs/>
+          <w:color w:val="5A6B7B"/>
+          <w:sz w:val="16"/>
+          <w:szCs w:val="16"/>
+        </w:rPr>
+        <w:t xml:space="preserve">PROMPT DE IMAGEN</w:t>
+      </w:r>
+    </w:p>
+    <w:p>
+      <w:pPr>
+        <w:pBdr>
+          <w:left w:val="single" w:color="B9C6D3" w:sz="14" w:space="8"/>
+        </w:pBdr>
+        <w:shd w:fill="F4F7FA" w:val="clear"/>
+        <w:spacing w:after="0"/>
+      </w:pPr>
+      <w:r>
+        <w:rPr>
+          <w:rFonts w:ascii="Consolas" w:cs="Consolas" w:eastAsia="Consolas" w:hAnsi="Consolas"/>
+          <w:sz w:val="18"/>
+          <w:szCs w:val="18"/>
+        </w:rPr>
+        <w:t xml:space="preserve">Siete imágenes de 1080x1080 px (1:1) de la misma familia, para carrusel. Fondo azul marino</w:t>
+      </w:r>
+    </w:p>
+    <w:p>
+      <w:pPr>
+        <w:pBdr>
+          <w:left w:val="single" w:color="B9C6D3" w:sz="14" w:space="8"/>
+        </w:pBdr>
+        <w:shd w:fill="F4F7FA" w:val="clear"/>
+        <w:spacing w:after="0"/>
+      </w:pPr>
+      <w:r>
+        <w:rPr>
+          <w:rFonts w:ascii="Consolas" w:cs="Consolas" w:eastAsia="Consolas" w:hAnsi="Consolas"/>
+          <w:sz w:val="18"/>
+          <w:szCs w:val="18"/>
+        </w:rPr>
+        <w:t xml:space="preserve">#0E2438. En cada una, un cuadro de diálogo de software dibujado en línea fina ámbar #E8A04A,</w:t>
+      </w:r>
+    </w:p>
+    <w:p>
+      <w:pPr>
+        <w:pBdr>
+          <w:left w:val="single" w:color="B9C6D3" w:sz="14" w:space="8"/>
+        </w:pBdr>
+        <w:shd w:fill="F4F7FA" w:val="clear"/>
+        <w:spacing w:after="0"/>
+      </w:pPr>
+      <w:r>
+        <w:rPr>
+          <w:rFonts w:ascii="Consolas" w:cs="Consolas" w:eastAsia="Consolas" w:hAnsi="Consolas"/>
+          <w:sz w:val="18"/>
+          <w:szCs w:val="18"/>
+        </w:rPr>
+        <w:t xml:space="preserve">siempre en la misma posición y a la misma escala, con el texto ilegible a propósito — solo se</w:t>
+      </w:r>
+    </w:p>
+    <w:p>
+      <w:pPr>
+        <w:pBdr>
+          <w:left w:val="single" w:color="B9C6D3" w:sz="14" w:space="8"/>
+        </w:pBdr>
+        <w:shd w:fill="F4F7FA" w:val="clear"/>
+        <w:spacing w:after="0"/>
+      </w:pPr>
+      <w:r>
+        <w:rPr>
+          <w:rFonts w:ascii="Consolas" w:cs="Consolas" w:eastAsia="Consolas" w:hAnsi="Consolas"/>
+          <w:sz w:val="18"/>
+          <w:szCs w:val="18"/>
+        </w:rPr>
+        <w:t xml:space="preserve">lee la forma de la ventana y su icono de advertencia. Lo que cambia de tarjeta a tarjeta es el</w:t>
+      </w:r>
+    </w:p>
+    <w:p>
+      <w:pPr>
+        <w:pBdr>
+          <w:left w:val="single" w:color="B9C6D3" w:sz="14" w:space="8"/>
+        </w:pBdr>
+        <w:shd w:fill="F4F7FA" w:val="clear"/>
+        <w:spacing w:after="0"/>
+      </w:pPr>
+      <w:r>
+        <w:rPr>
+          <w:rFonts w:ascii="Consolas" w:cs="Consolas" w:eastAsia="Consolas" w:hAnsi="Consolas"/>
+          <w:sz w:val="18"/>
+          <w:szCs w:val="18"/>
+        </w:rPr>
+        <w:t xml:space="preserve">fondo detrás del cuadro: una retícula de planta, dos muros solapados, dos objetos idénticos</w:t>
+      </w:r>
+    </w:p>
+    <w:p>
+      <w:pPr>
+        <w:pBdr>
+          <w:left w:val="single" w:color="B9C6D3" w:sz="14" w:space="8"/>
+        </w:pBdr>
+        <w:shd w:fill="F4F7FA" w:val="clear"/>
+        <w:spacing w:after="0"/>
+      </w:pPr>
+      <w:r>
+        <w:rPr>
+          <w:rFonts w:ascii="Consolas" w:cs="Consolas" w:eastAsia="Consolas" w:hAnsi="Consolas"/>
+          <w:sz w:val="18"/>
+          <w:szCs w:val="18"/>
+        </w:rPr>
+        <w:t xml:space="preserve">desfasados un milímetro, dos volúmenes que casi se tocan, y una carpeta vacía. Todo en línea</w:t>
+      </w:r>
+    </w:p>
+    <w:p>
+      <w:pPr>
+        <w:pBdr>
+          <w:left w:val="single" w:color="B9C6D3" w:sz="14" w:space="8"/>
+        </w:pBdr>
+        <w:shd w:fill="F4F7FA" w:val="clear"/>
+        <w:spacing w:after="0"/>
+      </w:pPr>
+      <w:r>
+        <w:rPr>
+          <w:rFonts w:ascii="Consolas" w:cs="Consolas" w:eastAsia="Consolas" w:hAnsi="Consolas"/>
+          <w:sz w:val="18"/>
+          <w:szCs w:val="18"/>
+        </w:rPr>
+        <w:t xml:space="preserve">blanca muy tenue. Sin texto legible en ninguna. Estilo Design Modeling Academy: fondo azul</w:t>
+      </w:r>
+    </w:p>
+    <w:p>
+      <w:pPr>
+        <w:pBdr>
+          <w:left w:val="single" w:color="B9C6D3" w:sz="14" w:space="8"/>
+        </w:pBdr>
+        <w:shd w:fill="F4F7FA" w:val="clear"/>
+        <w:spacing w:after="0"/>
+      </w:pPr>
+      <w:r>
+        <w:rPr>
+          <w:rFonts w:ascii="Consolas" w:cs="Consolas" w:eastAsia="Consolas" w:hAnsi="Consolas"/>
+          <w:sz w:val="18"/>
+          <w:szCs w:val="18"/>
+        </w:rPr>
+        <w:t xml:space="preserve">marino #0E2438, acentos en ámbar #E8A04A, tipografía sans-serif de palo seco muy gruesa,</w:t>
+      </w:r>
+    </w:p>
+    <w:p>
+      <w:pPr>
+        <w:pBdr>
+          <w:left w:val="single" w:color="B9C6D3" w:sz="14" w:space="8"/>
+        </w:pBdr>
+        <w:shd w:fill="F4F7FA" w:val="clear"/>
+        <w:spacing w:after="0"/>
+      </w:pPr>
+      <w:r>
+        <w:rPr>
+          <w:rFonts w:ascii="Consolas" w:cs="Consolas" w:eastAsia="Consolas" w:hAnsi="Consolas"/>
+          <w:sz w:val="18"/>
+          <w:szCs w:val="18"/>
+        </w:rPr>
+        <w:t xml:space="preserve">composición limpia y con aire, sin stock corporativo ni gente sonriendo a cámara. El texto</w:t>
+      </w:r>
+    </w:p>
+    <w:p>
+      <w:pPr>
+        <w:pBdr>
+          <w:left w:val="single" w:color="B9C6D3" w:sz="14" w:space="8"/>
+        </w:pBdr>
+        <w:shd w:fill="F4F7FA" w:val="clear"/>
+        <w:spacing w:after="140"/>
+      </w:pPr>
+      <w:r>
+        <w:rPr>
+          <w:rFonts w:ascii="Consolas" w:cs="Consolas" w:eastAsia="Consolas" w:hAnsi="Consolas"/>
+          <w:sz w:val="18"/>
+          <w:szCs w:val="18"/>
+        </w:rPr>
+        <w:t xml:space="preserve">final se monta en Canva: la IA entrega el fondo y los elementos, no las letras.</w:t>
+      </w:r>
+    </w:p>
+    <w:p>
+      <w:pPr>
         <w:spacing w:after="100" w:before="280"/>
       </w:pPr>
       <w:r>
@@ -25164,9 +25956,720 @@
           <w:sz w:val="18"/>
           <w:szCs w:val="18"/>
         </w:rPr>
+        <w:t xml:space="preserve">Abriste Dynamo una vez, no supiste por dónde seguir, y lo cerraste.</w:t>
+      </w:r>
+    </w:p>
+    <w:p>
+      <w:pPr>
+        <w:pBdr>
+          <w:left w:val="single" w:color="B9C6D3" w:sz="14" w:space="8"/>
+        </w:pBdr>
+        <w:shd w:fill="F7F9FB" w:val="clear"/>
+        <w:spacing w:after="0"/>
+      </w:pPr>
+      <w:r>
+        <w:rPr>
+          <w:rFonts w:ascii="Consolas" w:cs="Consolas" w:eastAsia="Consolas" w:hAnsi="Consolas"/>
+          <w:sz w:val="18"/>
+          <w:szCs w:val="18"/>
+        </w:rPr>
+        <w:t xml:space="preserve">La automatización en BIM no se atasca por falta de ideas. Se atasca en el primer script: el que</w:t>
+      </w:r>
+    </w:p>
+    <w:p>
+      <w:pPr>
+        <w:pBdr>
+          <w:left w:val="single" w:color="B9C6D3" w:sz="14" w:space="8"/>
+        </w:pBdr>
+        <w:shd w:fill="F7F9FB" w:val="clear"/>
+        <w:spacing w:after="0"/>
+      </w:pPr>
+      <w:r>
+        <w:rPr>
+          <w:rFonts w:ascii="Consolas" w:cs="Consolas" w:eastAsia="Consolas" w:hAnsi="Consolas"/>
+          <w:sz w:val="18"/>
+          <w:szCs w:val="18"/>
+        </w:rPr>
+        <w:t xml:space="preserve">tienes que escribir tú, sin saber todavía qué hace cada nodo.</w:t>
+      </w:r>
+    </w:p>
+    <w:p>
+      <w:pPr>
+        <w:pBdr>
+          <w:left w:val="single" w:color="B9C6D3" w:sz="14" w:space="8"/>
+        </w:pBdr>
+        <w:shd w:fill="F7F9FB" w:val="clear"/>
+        <w:spacing w:after="0"/>
+      </w:pPr>
+      <w:r>
+        <w:rPr>
+          <w:rFonts w:ascii="Consolas" w:cs="Consolas" w:eastAsia="Consolas" w:hAnsi="Consolas"/>
+          <w:sz w:val="18"/>
+          <w:szCs w:val="18"/>
+        </w:rPr>
+        <w:t xml:space="preserve"> </w:t>
+      </w:r>
+    </w:p>
+    <w:p>
+      <w:pPr>
+        <w:pBdr>
+          <w:left w:val="single" w:color="B9C6D3" w:sz="14" w:space="8"/>
+        </w:pBdr>
+        <w:shd w:fill="F7F9FB" w:val="clear"/>
+        <w:spacing w:after="0"/>
+      </w:pPr>
+      <w:r>
+        <w:rPr>
+          <w:rFonts w:ascii="Consolas" w:cs="Consolas" w:eastAsia="Consolas" w:hAnsi="Consolas"/>
+          <w:sz w:val="18"/>
+          <w:szCs w:val="18"/>
+        </w:rPr>
+        <w:t xml:space="preserve">Este pack es ese primer script hecho. Cinco, comentados línea por línea para que los cambies y</w:t>
+      </w:r>
+    </w:p>
+    <w:p>
+      <w:pPr>
+        <w:pBdr>
+          <w:left w:val="single" w:color="B9C6D3" w:sz="14" w:space="8"/>
+        </w:pBdr>
+        <w:shd w:fill="F7F9FB" w:val="clear"/>
+        <w:spacing w:after="0"/>
+      </w:pPr>
+      <w:r>
+        <w:rPr>
+          <w:rFonts w:ascii="Consolas" w:cs="Consolas" w:eastAsia="Consolas" w:hAnsi="Consolas"/>
+          <w:sz w:val="18"/>
+          <w:szCs w:val="18"/>
+        </w:rPr>
+        <w:t xml:space="preserve">no solo los ejecutes. Tres de ellos ni siquiera tocan tu modelo — solo leen — así que puedes</w:t>
+      </w:r>
+    </w:p>
+    <w:p>
+      <w:pPr>
+        <w:pBdr>
+          <w:left w:val="single" w:color="B9C6D3" w:sz="14" w:space="8"/>
+        </w:pBdr>
+        <w:shd w:fill="F7F9FB" w:val="clear"/>
+        <w:spacing w:after="0"/>
+      </w:pPr>
+      <w:r>
+        <w:rPr>
+          <w:rFonts w:ascii="Consolas" w:cs="Consolas" w:eastAsia="Consolas" w:hAnsi="Consolas"/>
+          <w:sz w:val="18"/>
+          <w:szCs w:val="18"/>
+        </w:rPr>
+        <w:t xml:space="preserve">correrlos hoy en un archivo vivo sin arriesgar nada.</w:t>
+      </w:r>
+    </w:p>
+    <w:p>
+      <w:pPr>
+        <w:pBdr>
+          <w:left w:val="single" w:color="B9C6D3" w:sz="14" w:space="8"/>
+        </w:pBdr>
+        <w:shd w:fill="F7F9FB" w:val="clear"/>
+        <w:spacing w:after="0"/>
+      </w:pPr>
+      <w:r>
+        <w:rPr>
+          <w:rFonts w:ascii="Consolas" w:cs="Consolas" w:eastAsia="Consolas" w:hAnsi="Consolas"/>
+          <w:sz w:val="18"/>
+          <w:szCs w:val="18"/>
+        </w:rPr>
+        <w:t xml:space="preserve"> </w:t>
+      </w:r>
+    </w:p>
+    <w:p>
+      <w:pPr>
+        <w:pBdr>
+          <w:left w:val="single" w:color="B9C6D3" w:sz="14" w:space="8"/>
+        </w:pBdr>
+        <w:shd w:fill="F7F9FB" w:val="clear"/>
+        <w:spacing w:after="0"/>
+      </w:pPr>
+      <w:r>
+        <w:rPr>
+          <w:rFonts w:ascii="Consolas" w:cs="Consolas" w:eastAsia="Consolas" w:hAnsi="Consolas"/>
+          <w:sz w:val="18"/>
+          <w:szCs w:val="18"/>
+        </w:rPr>
+        <w:t xml:space="preserve">Con el PDF de instalación y la versión exacta de Revit y Dynamo con la que los probamos.</w:t>
+      </w:r>
+    </w:p>
+    <w:p>
+      <w:pPr>
+        <w:pBdr>
+          <w:left w:val="single" w:color="B9C6D3" w:sz="14" w:space="8"/>
+        </w:pBdr>
+        <w:shd w:fill="F7F9FB" w:val="clear"/>
+        <w:spacing w:after="0"/>
+      </w:pPr>
+      <w:r>
+        <w:rPr>
+          <w:rFonts w:ascii="Consolas" w:cs="Consolas" w:eastAsia="Consolas" w:hAnsi="Consolas"/>
+          <w:sz w:val="18"/>
+          <w:szCs w:val="18"/>
+        </w:rPr>
+        <w:t xml:space="preserve"> </w:t>
+      </w:r>
+    </w:p>
+    <w:p>
+      <w:pPr>
+        <w:pBdr>
+          <w:left w:val="single" w:color="B9C6D3" w:sz="14" w:space="8"/>
+        </w:pBdr>
+        <w:shd w:fill="F7F9FB" w:val="clear"/>
+        <w:spacing w:after="0"/>
+      </w:pPr>
+      <w:r>
+        <w:rPr>
+          <w:rFonts w:ascii="Consolas" w:cs="Consolas" w:eastAsia="Consolas" w:hAnsi="Consolas"/>
+          <w:sz w:val="18"/>
+          <w:szCs w:val="18"/>
+        </w:rPr>
+        <w:t xml:space="preserve">Es gratis. Comenta DYNAMO y te llega.</w:t>
+      </w:r>
+    </w:p>
+    <w:p>
+      <w:pPr>
+        <w:pBdr>
+          <w:left w:val="single" w:color="B9C6D3" w:sz="14" w:space="8"/>
+        </w:pBdr>
+        <w:shd w:fill="F7F9FB" w:val="clear"/>
+        <w:spacing w:after="0"/>
+      </w:pPr>
+      <w:r>
+        <w:rPr>
+          <w:rFonts w:ascii="Consolas" w:cs="Consolas" w:eastAsia="Consolas" w:hAnsi="Consolas"/>
+          <w:sz w:val="18"/>
+          <w:szCs w:val="18"/>
+        </w:rPr>
+        <w:t xml:space="preserve"> </w:t>
+      </w:r>
+    </w:p>
+    <w:p>
+      <w:pPr>
+        <w:pBdr>
+          <w:left w:val="single" w:color="B9C6D3" w:sz="14" w:space="8"/>
+        </w:pBdr>
+        <w:shd w:fill="F7F9FB" w:val="clear"/>
+        <w:spacing w:after="140"/>
+      </w:pPr>
+      <w:r>
+        <w:rPr>
+          <w:rFonts w:ascii="Consolas" w:cs="Consolas" w:eastAsia="Consolas" w:hAnsi="Consolas"/>
+          <w:sz w:val="18"/>
+          <w:szCs w:val="18"/>
+        </w:rPr>
+        <w:t xml:space="preserve">¿Cuántas veces has abierto Dynamo y lo has vuelto a cerrar?</w:t>
+      </w:r>
+    </w:p>
+    <w:p>
+      <w:pPr>
+        <w:spacing w:after="80"/>
+        <w:rPr>
+          <w:b/>
+          <w:bCs/>
+        </w:rPr>
+      </w:pPr>
+      <w:r>
+        <w:rPr>
+          <w:b/>
+          <w:bCs/>
+          <w:sz w:val="21"/>
+          <w:szCs w:val="21"/>
+        </w:rPr>
+        <w:t xml:space="preserve">CTA: Comenta DYNAMO</w:t>
+      </w:r>
+    </w:p>
+    <w:p>
+      <w:pPr>
+        <w:spacing w:after="80"/>
+        <w:rPr>
+          <w:b/>
+          <w:bCs/>
+          <w:color w:val="5A6B7B"/>
+          <w:sz w:val="16"/>
+          <w:szCs w:val="16"/>
+        </w:rPr>
+      </w:pPr>
+      <w:r>
+        <w:rPr>
+          <w:b/>
+          <w:bCs/>
+          <w:color w:val="5A6B7B"/>
+          <w:sz w:val="16"/>
+          <w:szCs w:val="16"/>
+        </w:rPr>
+        <w:t xml:space="preserve">PROMPT DE IMAGEN</w:t>
+      </w:r>
+    </w:p>
+    <w:p>
+      <w:pPr>
+        <w:pBdr>
+          <w:left w:val="single" w:color="B9C6D3" w:sz="14" w:space="8"/>
+        </w:pBdr>
+        <w:shd w:fill="F4F7FA" w:val="clear"/>
+        <w:spacing w:after="0"/>
+      </w:pPr>
+      <w:r>
+        <w:rPr>
+          <w:rFonts w:ascii="Consolas" w:cs="Consolas" w:eastAsia="Consolas" w:hAnsi="Consolas"/>
+          <w:sz w:val="18"/>
+          <w:szCs w:val="18"/>
+        </w:rPr>
+        <w:t xml:space="preserve">Imagen 1080x1350 px (4:5) para la portada del reel. Fondo azul marino #0E2438. Un grafo de</w:t>
+      </w:r>
+    </w:p>
+    <w:p>
+      <w:pPr>
+        <w:pBdr>
+          <w:left w:val="single" w:color="B9C6D3" w:sz="14" w:space="8"/>
+        </w:pBdr>
+        <w:shd w:fill="F4F7FA" w:val="clear"/>
+        <w:spacing w:after="0"/>
+      </w:pPr>
+      <w:r>
+        <w:rPr>
+          <w:rFonts w:ascii="Consolas" w:cs="Consolas" w:eastAsia="Consolas" w:hAnsi="Consolas"/>
+          <w:sz w:val="18"/>
+          <w:szCs w:val="18"/>
+        </w:rPr>
+        <w:t xml:space="preserve">nodos tipo Dynamo dibujado en línea fina ámbar #E8A04A: dos cajas conectadas por un solo cable</w:t>
+      </w:r>
+    </w:p>
+    <w:p>
+      <w:pPr>
+        <w:pBdr>
+          <w:left w:val="single" w:color="B9C6D3" w:sz="14" w:space="8"/>
+        </w:pBdr>
+        <w:shd w:fill="F4F7FA" w:val="clear"/>
+        <w:spacing w:after="0"/>
+      </w:pPr>
+      <w:r>
+        <w:rPr>
+          <w:rFonts w:ascii="Consolas" w:cs="Consolas" w:eastAsia="Consolas" w:hAnsi="Consolas"/>
+          <w:sz w:val="18"/>
+          <w:szCs w:val="18"/>
+        </w:rPr>
+        <w:t xml:space="preserve">curvo y limpio, muy pocas, con mucho aire alrededor. La idea es «el primero», no «muchos».</w:t>
+      </w:r>
+    </w:p>
+    <w:p>
+      <w:pPr>
+        <w:pBdr>
+          <w:left w:val="single" w:color="B9C6D3" w:sz="14" w:space="8"/>
+        </w:pBdr>
+        <w:shd w:fill="F4F7FA" w:val="clear"/>
+        <w:spacing w:after="0"/>
+      </w:pPr>
+      <w:r>
+        <w:rPr>
+          <w:rFonts w:ascii="Consolas" w:cs="Consolas" w:eastAsia="Consolas" w:hAnsi="Consolas"/>
+          <w:sz w:val="18"/>
+          <w:szCs w:val="18"/>
+        </w:rPr>
+        <w:t xml:space="preserve">Detrás, muy tenue, una retícula de planta. Sin texto legible dentro de los nodos. Estilo Design</w:t>
+      </w:r>
+    </w:p>
+    <w:p>
+      <w:pPr>
+        <w:pBdr>
+          <w:left w:val="single" w:color="B9C6D3" w:sz="14" w:space="8"/>
+        </w:pBdr>
+        <w:shd w:fill="F4F7FA" w:val="clear"/>
+        <w:spacing w:after="0"/>
+      </w:pPr>
+      <w:r>
+        <w:rPr>
+          <w:rFonts w:ascii="Consolas" w:cs="Consolas" w:eastAsia="Consolas" w:hAnsi="Consolas"/>
+          <w:sz w:val="18"/>
+          <w:szCs w:val="18"/>
+        </w:rPr>
+        <w:t xml:space="preserve">Modeling Academy: fondo azul marino #0E2438, acentos en ámbar #E8A04A, tipografía sans-serif de</w:t>
+      </w:r>
+    </w:p>
+    <w:p>
+      <w:pPr>
+        <w:pBdr>
+          <w:left w:val="single" w:color="B9C6D3" w:sz="14" w:space="8"/>
+        </w:pBdr>
+        <w:shd w:fill="F4F7FA" w:val="clear"/>
+        <w:spacing w:after="0"/>
+      </w:pPr>
+      <w:r>
+        <w:rPr>
+          <w:rFonts w:ascii="Consolas" w:cs="Consolas" w:eastAsia="Consolas" w:hAnsi="Consolas"/>
+          <w:sz w:val="18"/>
+          <w:szCs w:val="18"/>
+        </w:rPr>
+        <w:t xml:space="preserve">palo seco muy gruesa, composición limpia y con aire, sin stock corporativo ni gente sonriendo a</w:t>
+      </w:r>
+    </w:p>
+    <w:p>
+      <w:pPr>
+        <w:pBdr>
+          <w:left w:val="single" w:color="B9C6D3" w:sz="14" w:space="8"/>
+        </w:pBdr>
+        <w:shd w:fill="F4F7FA" w:val="clear"/>
+        <w:spacing w:after="0"/>
+      </w:pPr>
+      <w:r>
+        <w:rPr>
+          <w:rFonts w:ascii="Consolas" w:cs="Consolas" w:eastAsia="Consolas" w:hAnsi="Consolas"/>
+          <w:sz w:val="18"/>
+          <w:szCs w:val="18"/>
+        </w:rPr>
+        <w:t xml:space="preserve">cámara. El texto final se monta en Canva: la IA entrega el fondo y los elementos, no las</w:t>
+      </w:r>
+    </w:p>
+    <w:p>
+      <w:pPr>
+        <w:pBdr>
+          <w:left w:val="single" w:color="B9C6D3" w:sz="14" w:space="8"/>
+        </w:pBdr>
+        <w:shd w:fill="F4F7FA" w:val="clear"/>
+        <w:spacing w:after="140"/>
+      </w:pPr>
+      <w:r>
+        <w:rPr>
+          <w:rFonts w:ascii="Consolas" w:cs="Consolas" w:eastAsia="Consolas" w:hAnsi="Consolas"/>
+          <w:sz w:val="18"/>
+          <w:szCs w:val="18"/>
+        </w:rPr>
+        <w:t xml:space="preserve">letras.</w:t>
+      </w:r>
+    </w:p>
+    <w:p>
+      <w:pPr>
+        <w:spacing w:after="80" w:before="200"/>
+      </w:pPr>
+      <w:r>
+        <w:rPr>
+          <w:b/>
+          <w:bCs/>
+          <w:color w:val="0E2438"/>
+          <w:sz w:val="22"/>
+          <w:szCs w:val="22"/>
+        </w:rPr>
+        <w:t xml:space="preserve">Post de lanzamiento · Jue 24 · CARRUSEL (6 slides) — EXTRA de lanzamiento</w:t>
+      </w:r>
+    </w:p>
+    <w:p>
+      <w:pPr>
+        <w:spacing w:after="80"/>
+        <w:rPr>
+          <w:i/>
+          <w:iCs/>
+          <w:color w:val="5A6B7B"/>
+        </w:rPr>
+      </w:pPr>
+      <w:r>
+        <w:rPr>
+          <w:i/>
+          <w:iCs/>
+          <w:color w:val="5A6B7B"/>
+          <w:sz w:val="21"/>
+          <w:szCs w:val="21"/>
+        </w:rPr>
+        <w:t xml:space="preserve">Redes: Instagram + Facebook + LinkedIn (PDF)</w:t>
+      </w:r>
+    </w:p>
+    <w:p>
+      <w:pPr>
+        <w:pBdr>
+          <w:left w:val="single" w:color="C96A1C" w:sz="18" w:space="8"/>
+        </w:pBdr>
+        <w:shd w:fill="F4F7FA" w:val="clear"/>
+        <w:spacing w:after="100"/>
+      </w:pPr>
+      <w:r>
+        <w:rPr>
+          <w:i/>
+          <w:iCs/>
+          <w:color w:val="5A6B7B"/>
+          <w:sz w:val="20"/>
+          <w:szCs w:val="20"/>
+        </w:rPr>
+        <w:t xml:space="preserve">Segunda pieza del mismo recurso, dos días después del reel. Dynamo es el tema de mejor guardado de la cuenta y el carrusel es el formato que más se guarda: el reel trae el alcance y este se queda archivado. Dos ventanas de comentarios para la misma palabra.</w:t>
+      </w:r>
+    </w:p>
+    <w:p>
+      <w:pPr>
+        <w:pBdr>
+          <w:left w:val="single" w:color="B9C6D3" w:sz="14" w:space="8"/>
+        </w:pBdr>
+        <w:shd w:fill="F7F9FB" w:val="clear"/>
+        <w:spacing w:after="140"/>
+      </w:pPr>
+      <w:r>
+        <w:rPr>
+          <w:rFonts w:ascii="Consolas" w:cs="Consolas" w:eastAsia="Consolas" w:hAnsi="Consolas"/>
+          <w:sz w:val="18"/>
+          <w:szCs w:val="18"/>
+        </w:rPr>
         <w:t xml:space="preserve">Cinco tareas de Revit que no deberías seguir haciendo a mano.</w:t>
       </w:r>
     </w:p>
+    <w:p>
+      <w:pPr>
+        <w:spacing w:after="80"/>
+        <w:rPr>
+          <w:b/>
+          <w:bCs/>
+          <w:color w:val="5A6B7B"/>
+          <w:sz w:val="16"/>
+          <w:szCs w:val="16"/>
+        </w:rPr>
+      </w:pPr>
+      <w:r>
+        <w:rPr>
+          <w:b/>
+          <w:bCs/>
+          <w:color w:val="5A6B7B"/>
+          <w:sz w:val="16"/>
+          <w:szCs w:val="16"/>
+        </w:rPr>
+        <w:t xml:space="preserve">DIAPOSITIVAS</w:t>
+      </w:r>
+    </w:p>
+    <w:tbl>
+      <w:tblPr>
+        <w:tblW w:type="dxa" w:w="9000"/>
+        <w:tblBorders>
+          <w:top w:val="single" w:color="auto" w:sz="4"/>
+          <w:left w:val="single" w:color="auto" w:sz="4"/>
+          <w:bottom w:val="single" w:color="auto" w:sz="4"/>
+          <w:right w:val="single" w:color="auto" w:sz="4"/>
+          <w:insideH w:val="single" w:color="auto" w:sz="4"/>
+          <w:insideV w:val="single" w:color="auto" w:sz="4"/>
+        </w:tblBorders>
+      </w:tblPr>
+      <w:tblGrid>
+        <w:gridCol w:w="600"/>
+        <w:gridCol w:w="8400"/>
+      </w:tblGrid>
+      <w:tr>
+        <w:trPr>
+          <w:tblHeader/>
+        </w:trPr>
+        <w:tc>
+          <w:tcPr>
+            <w:tcW w:type="dxa" w:w="600"/>
+            <w:shd w:fill="0E2438" w:val="clear"/>
+          </w:tcPr>
+          <w:p>
+            <w:r>
+              <w:rPr>
+                <w:b/>
+                <w:bCs/>
+                <w:color w:val="FFFFFF"/>
+                <w:sz w:val="18"/>
+                <w:szCs w:val="18"/>
+              </w:rPr>
+              <w:t xml:space="preserve">#</w:t>
+            </w:r>
+          </w:p>
+        </w:tc>
+        <w:tc>
+          <w:tcPr>
+            <w:tcW w:type="dxa" w:w="8400"/>
+            <w:shd w:fill="0E2438" w:val="clear"/>
+          </w:tcPr>
+          <w:p>
+            <w:r>
+              <w:rPr>
+                <w:b/>
+                <w:bCs/>
+                <w:color w:val="FFFFFF"/>
+                <w:sz w:val="18"/>
+                <w:szCs w:val="18"/>
+              </w:rPr>
+              <w:t xml:space="preserve">Qué va en la diapositiva</w:t>
+            </w:r>
+          </w:p>
+        </w:tc>
+      </w:tr>
+      <w:tr>
+        <w:tc>
+          <w:tcPr>
+            <w:tcW w:type="dxa" w:w="600"/>
+          </w:tcPr>
+          <w:p>
+            <w:r>
+              <w:rPr>
+                <w:sz w:val="18"/>
+                <w:szCs w:val="18"/>
+              </w:rPr>
+              <w:t xml:space="preserve">1</w:t>
+            </w:r>
+          </w:p>
+        </w:tc>
+        <w:tc>
+          <w:tcPr>
+            <w:tcW w:type="dxa" w:w="8400"/>
+          </w:tcPr>
+          <w:p>
+            <w:r>
+              <w:rPr>
+                <w:sz w:val="18"/>
+                <w:szCs w:val="18"/>
+              </w:rPr>
+              <w:t xml:space="preserve">1 · CINCO TAREAS DE REVIT QUE NO DEBERÍAS SEGUIR HACIENDO A MANO.</w:t>
+            </w:r>
+          </w:p>
+        </w:tc>
+      </w:tr>
+      <w:tr>
+        <w:tc>
+          <w:tcPr>
+            <w:tcW w:type="dxa" w:w="600"/>
+          </w:tcPr>
+          <w:p>
+            <w:r>
+              <w:rPr>
+                <w:sz w:val="18"/>
+                <w:szCs w:val="18"/>
+              </w:rPr>
+              <w:t xml:space="preserve">2</w:t>
+            </w:r>
+          </w:p>
+        </w:tc>
+        <w:tc>
+          <w:tcPr>
+            <w:tcW w:type="dxa" w:w="8400"/>
+          </w:tcPr>
+          <w:p>
+            <w:r>
+              <w:rPr>
+                <w:sz w:val="18"/>
+                <w:szCs w:val="18"/>
+              </w:rPr>
+              <w:t xml:space="preserve">2 · Renombrar vistas por norma, una por una. → Script 1: las renombra en lote.</w:t>
+            </w:r>
+          </w:p>
+        </w:tc>
+      </w:tr>
+      <w:tr>
+        <w:tc>
+          <w:tcPr>
+            <w:tcW w:type="dxa" w:w="600"/>
+          </w:tcPr>
+          <w:p>
+            <w:r>
+              <w:rPr>
+                <w:sz w:val="18"/>
+                <w:szCs w:val="18"/>
+              </w:rPr>
+              <w:t xml:space="preserve">3</w:t>
+            </w:r>
+          </w:p>
+        </w:tc>
+        <w:tc>
+          <w:tcPr>
+            <w:tcW w:type="dxa" w:w="8400"/>
+          </w:tcPr>
+          <w:p>
+            <w:r>
+              <w:rPr>
+                <w:sz w:val="18"/>
+                <w:szCs w:val="18"/>
+              </w:rPr>
+              <w:t xml:space="preserve">3 · Exportar planos abriendo el cuadro de diálogo cada vez. → Script 2: los exporta a PDF con el nombre correcto, sin tocar el diálogo.</w:t>
+            </w:r>
+          </w:p>
+        </w:tc>
+      </w:tr>
+      <w:tr>
+        <w:tc>
+          <w:tcPr>
+            <w:tcW w:type="dxa" w:w="600"/>
+          </w:tcPr>
+          <w:p>
+            <w:r>
+              <w:rPr>
+                <w:sz w:val="18"/>
+                <w:szCs w:val="18"/>
+              </w:rPr>
+              <w:t xml:space="preserve">4</w:t>
+            </w:r>
+          </w:p>
+        </w:tc>
+        <w:tc>
+          <w:tcPr>
+            <w:tcW w:type="dxa" w:w="8400"/>
+          </w:tcPr>
+          <w:p>
+            <w:r>
+              <w:rPr>
+                <w:sz w:val="18"/>
+                <w:szCs w:val="18"/>
+              </w:rPr>
+              <w:t xml:space="preserve">4 · Numerar elementos y que salgan por orden de creación en vez de por posición. → Script 3: los numera por dónde están.</w:t>
+            </w:r>
+          </w:p>
+        </w:tc>
+      </w:tr>
+      <w:tr>
+        <w:tc>
+          <w:tcPr>
+            <w:tcW w:type="dxa" w:w="600"/>
+          </w:tcPr>
+          <w:p>
+            <w:r>
+              <w:rPr>
+                <w:sz w:val="18"/>
+                <w:szCs w:val="18"/>
+              </w:rPr>
+              <w:t xml:space="preserve">5</w:t>
+            </w:r>
+          </w:p>
+        </w:tc>
+        <w:tc>
+          <w:tcPr>
+            <w:tcW w:type="dxa" w:w="8400"/>
+          </w:tcPr>
+          <w:p>
+            <w:r>
+              <w:rPr>
+                <w:sz w:val="18"/>
+                <w:szCs w:val="18"/>
+              </w:rPr>
+              <w:t xml:space="preserve">5 · Revisar parámetros vacíos a ojo antes de entregar. → Script 4: te los lista. Y el Script 5 compara dos modelos y te dice qué cambió.</w:t>
+            </w:r>
+          </w:p>
+        </w:tc>
+      </w:tr>
+      <w:tr>
+        <w:tc>
+          <w:tcPr>
+            <w:tcW w:type="dxa" w:w="600"/>
+          </w:tcPr>
+          <w:p>
+            <w:r>
+              <w:rPr>
+                <w:sz w:val="18"/>
+                <w:szCs w:val="18"/>
+              </w:rPr>
+              <w:t xml:space="preserve">6</w:t>
+            </w:r>
+          </w:p>
+        </w:tc>
+        <w:tc>
+          <w:tcPr>
+            <w:tcW w:type="dxa" w:w="8400"/>
+          </w:tcPr>
+          <w:p>
+            <w:r>
+              <w:rPr>
+                <w:sz w:val="18"/>
+                <w:szCs w:val="18"/>
+              </w:rPr>
+              <w:t xml:space="preserve">6 · Los cinco vienen comentados por dentro para que los cambies. TRES SOLO LEEN: los puedes correr hoy en un archivo vivo. COMENTA DYNAMO.</w:t>
+            </w:r>
+          </w:p>
+        </w:tc>
+      </w:tr>
+    </w:tbl>
     <w:p>
       <w:pPr>
         <w:pBdr>
@@ -25784,7 +27287,7 @@
           <w:sz w:val="21"/>
           <w:szCs w:val="21"/>
         </w:rPr>
-        <w:t xml:space="preserve">· Los cinco errores por los que devuelven una memoria — y cómo se ve cada uno corregido.</w:t>
+        <w:t xml:space="preserve">· Los SEIS errores por los que devuelven una memoria — y cómo se ve cada uno corregido. (Corregido 9-sep: aquí decía cinco; la guía publicada tiene seis y el reel también dice seis. El que mentía era este listado.)</w:t>
       </w:r>
     </w:p>
     <w:p>
@@ -26179,7 +27682,7 @@
           <w:sz w:val="21"/>
           <w:szCs w:val="21"/>
         </w:rPr>
-        <w:t xml:space="preserve">Redes: Instagram + Facebook</w:t>
+        <w:t xml:space="preserve">Redes: Instagram + Facebook + TikTok</w:t>
       </w:r>
     </w:p>
     <w:p>
@@ -26196,41 +27699,24 @@
           <w:sz w:val="18"/>
           <w:szCs w:val="18"/>
         </w:rPr>
-        <w:t xml:space="preserve">Una memoria de cálculo no se devuelve por los números. Se devuelve por lo que no está escrito.</w:t>
-      </w:r>
-    </w:p>
-    <w:p>
-      <w:pPr>
-        <w:pBdr>
-          <w:left w:val="single" w:color="B9C6D3" w:sz="14" w:space="8"/>
-        </w:pBdr>
-        <w:shd w:fill="F7F9FB" w:val="clear"/>
-        <w:spacing w:after="0"/>
-      </w:pPr>
-      <w:r>
-        <w:rPr>
-          <w:rFonts w:ascii="Consolas" w:cs="Consolas" w:eastAsia="Consolas" w:hAnsi="Consolas"/>
-          <w:sz w:val="18"/>
-          <w:szCs w:val="18"/>
-        </w:rPr>
-        <w:t xml:space="preserve">Hipótesis que no se declararon. Criterios que se adoptaron y no se justificaron. Normativa</w:t>
-      </w:r>
-    </w:p>
-    <w:p>
-      <w:pPr>
-        <w:pBdr>
-          <w:left w:val="single" w:color="B9C6D3" w:sz="14" w:space="8"/>
-        </w:pBdr>
-        <w:shd w:fill="F7F9FB" w:val="clear"/>
-        <w:spacing w:after="0"/>
-      </w:pPr>
-      <w:r>
-        <w:rPr>
-          <w:rFonts w:ascii="Consolas" w:cs="Consolas" w:eastAsia="Consolas" w:hAnsi="Consolas"/>
-          <w:sz w:val="18"/>
-          <w:szCs w:val="18"/>
-        </w:rPr>
-        <w:t xml:space="preserve">citada sin versión.</w:t>
+        <w:t xml:space="preserve">Te devolvieron la memoria y no era el cálculo.</w:t>
+      </w:r>
+    </w:p>
+    <w:p>
+      <w:pPr>
+        <w:pBdr>
+          <w:left w:val="single" w:color="B9C6D3" w:sz="14" w:space="8"/>
+        </w:pBdr>
+        <w:shd w:fill="F7F9FB" w:val="clear"/>
+        <w:spacing w:after="0"/>
+      </w:pPr>
+      <w:r>
+        <w:rPr>
+          <w:rFonts w:ascii="Consolas" w:cs="Consolas" w:eastAsia="Consolas" w:hAnsi="Consolas"/>
+          <w:sz w:val="18"/>
+          <w:szCs w:val="18"/>
+        </w:rPr>
+        <w:t xml:space="preserve">Se devuelve porque el revisor no puede comprobar que esté bien. No es lo mismo.</w:t>
       </w:r>
     </w:p>
     <w:p>
@@ -26264,7 +27750,24 @@
           <w:sz w:val="18"/>
           <w:szCs w:val="18"/>
         </w:rPr>
-        <w:t xml:space="preserve">El cálculo estaba bien. El documento no lo demostraba.</w:t>
+        <w:t xml:space="preserve">La guía trae las 12 secciones en orden y qué va en cada una, y los 6 errores por los que una</w:t>
+      </w:r>
+    </w:p>
+    <w:p>
+      <w:pPr>
+        <w:pBdr>
+          <w:left w:val="single" w:color="B9C6D3" w:sz="14" w:space="8"/>
+        </w:pBdr>
+        <w:shd w:fill="F7F9FB" w:val="clear"/>
+        <w:spacing w:after="0"/>
+      </w:pPr>
+      <w:r>
+        <w:rPr>
+          <w:rFonts w:ascii="Consolas" w:cs="Consolas" w:eastAsia="Consolas" w:hAnsi="Consolas"/>
+          <w:sz w:val="18"/>
+          <w:szCs w:val="18"/>
+        </w:rPr>
+        <w:t xml:space="preserve">memoria vuelve a tu escritorio. Los seis tienen algo en común, y está explicado.</w:t>
       </w:r>
     </w:p>
     <w:p>
@@ -26298,24 +27801,24 @@
           <w:sz w:val="18"/>
           <w:szCs w:val="18"/>
         </w:rPr>
-        <w:t xml:space="preserve">Armamos la guía con la estructura completa de una memoria que se sostiene ante revisión, y la</w:t>
-      </w:r>
-    </w:p>
-    <w:p>
-      <w:pPr>
-        <w:pBdr>
-          <w:left w:val="single" w:color="B9C6D3" w:sz="14" w:space="8"/>
-        </w:pBdr>
-        <w:shd w:fill="F7F9FB" w:val="clear"/>
-        <w:spacing w:after="0"/>
-      </w:pPr>
-      <w:r>
-        <w:rPr>
-          <w:rFonts w:ascii="Consolas" w:cs="Consolas" w:eastAsia="Consolas" w:hAnsi="Consolas"/>
-          <w:sz w:val="18"/>
-          <w:szCs w:val="18"/>
-        </w:rPr>
-        <w:t xml:space="preserve">plantilla editable para llenarla.</w:t>
+        <w:t xml:space="preserve">Con la plantilla en Word ya montada y la hoja de Excel para el resumen de verificaciones. Para</w:t>
+      </w:r>
+    </w:p>
+    <w:p>
+      <w:pPr>
+        <w:pBdr>
+          <w:left w:val="single" w:color="B9C6D3" w:sz="14" w:space="8"/>
+        </w:pBdr>
+        <w:shd w:fill="F7F9FB" w:val="clear"/>
+        <w:spacing w:after="0"/>
+      </w:pPr>
+      <w:r>
+        <w:rPr>
+          <w:rFonts w:ascii="Consolas" w:cs="Consolas" w:eastAsia="Consolas" w:hAnsi="Consolas"/>
+          <w:sz w:val="18"/>
+          <w:szCs w:val="18"/>
+        </w:rPr>
+        <w:t xml:space="preserve">no armarla nunca más desde cero.</w:t>
       </w:r>
     </w:p>
     <w:p>
@@ -26440,7 +27943,7 @@
           <w:sz w:val="18"/>
           <w:szCs w:val="18"/>
         </w:rPr>
-        <w:t xml:space="preserve">Imagen 1080x1350 px (4:5). Fondo azul marino #0E2438. Un documento técnico visto de frente y en</w:t>
+        <w:t xml:space="preserve">Imagen 1080x1350 px (4:5) para la portada del reel. Fondo azul marino #0E2438. Un índice de</w:t>
       </w:r>
     </w:p>
     <w:p>
@@ -26457,7 +27960,7 @@
           <w:sz w:val="18"/>
           <w:szCs w:val="18"/>
         </w:rPr>
-        <w:t xml:space="preserve">perspectiva muy leve, dibujado en línea fina ámbar #E8A04A, con la silueta de párrafos y una</w:t>
+        <w:t xml:space="preserve">documento técnico dibujado en línea fina ámbar #E8A04A: doce renglones numerados, alineados,</w:t>
       </w:r>
     </w:p>
     <w:p>
@@ -26474,7 +27977,7 @@
           <w:sz w:val="18"/>
           <w:szCs w:val="18"/>
         </w:rPr>
-        <w:t xml:space="preserve">tabla — el texto ilegible a propósito. Dos de sus secciones aparecen vacías, marcadas con un</w:t>
+        <w:t xml:space="preserve">con el texto ilegible a propósito. Seis de ellos llevan una marca ámbar más gruesa al margen.</w:t>
       </w:r>
     </w:p>
     <w:p>
@@ -26491,7 +27994,7 @@
           <w:sz w:val="18"/>
           <w:szCs w:val="18"/>
         </w:rPr>
-        <w:t xml:space="preserve">recuadro ámbar más grueso, como huecos. Sobrio, nada de sellos rojos ni de gestos de rechazo.</w:t>
+        <w:t xml:space="preserve">Sobrio y ordenado, nada de sellos rojos. Sin texto legible. Estilo Design Modeling Academy:</w:t>
       </w:r>
     </w:p>
     <w:p>
@@ -26508,7 +28011,7 @@
           <w:sz w:val="18"/>
           <w:szCs w:val="18"/>
         </w:rPr>
-        <w:t xml:space="preserve">Estilo Design Modeling Academy: fondo azul marino #0E2438, acentos en ámbar #E8A04A, tipografía</w:t>
+        <w:t xml:space="preserve">fondo azul marino #0E2438, acentos en ámbar #E8A04A, tipografía sans-serif de palo seco muy</w:t>
       </w:r>
     </w:p>
     <w:p>
@@ -26525,24 +28028,7 @@
           <w:sz w:val="18"/>
           <w:szCs w:val="18"/>
         </w:rPr>
-        <w:t xml:space="preserve">sans-serif de palo seco muy gruesa, composición limpia y con aire, sin stock corporativo ni</w:t>
-      </w:r>
-    </w:p>
-    <w:p>
-      <w:pPr>
-        <w:pBdr>
-          <w:left w:val="single" w:color="B9C6D3" w:sz="14" w:space="8"/>
-        </w:pBdr>
-        <w:shd w:fill="F4F7FA" w:val="clear"/>
-        <w:spacing w:after="0"/>
-      </w:pPr>
-      <w:r>
-        <w:rPr>
-          <w:rFonts w:ascii="Consolas" w:cs="Consolas" w:eastAsia="Consolas" w:hAnsi="Consolas"/>
-          <w:sz w:val="18"/>
-          <w:szCs w:val="18"/>
-        </w:rPr>
-        <w:t xml:space="preserve">gente sonriendo a cámara. El texto final se monta en Canva: la IA entrega el fondo y los</w:t>
+        <w:t xml:space="preserve">gruesa, composición limpia y con aire, sin stock corporativo ni gente sonriendo a cámara. El</w:t>
       </w:r>
     </w:p>
     <w:p>
@@ -26559,462 +28045,22 @@
           <w:sz w:val="18"/>
           <w:szCs w:val="18"/>
         </w:rPr>
-        <w:t xml:space="preserve">elementos, no las letras.</w:t>
-      </w:r>
-    </w:p>
-    <w:p>
-      <w:pPr>
-        <w:spacing w:after="100" w:before="280"/>
-      </w:pPr>
-      <w:r>
-        <w:rPr>
-          <w:b/>
-          <w:bCs/>
-          <w:color w:val="C96A1C"/>
-          <w:sz w:val="26"/>
-          <w:szCs w:val="26"/>
-        </w:rPr>
-        <w:t xml:space="preserve">El montaje en GoHighLevel — el mismo para los tres</w:t>
-      </w:r>
-    </w:p>
-    <w:p>
-      <w:pPr>
-        <w:spacing w:after="80"/>
-        <w:rPr>
-          <w:b/>
-          <w:bCs/>
-        </w:rPr>
-      </w:pPr>
-      <w:r>
-        <w:rPr>
-          <w:b/>
-          <w:bCs/>
-          <w:sz w:val="21"/>
-          <w:szCs w:val="21"/>
-        </w:rPr>
-        <w:t xml:space="preserve">1. El archivo, con URL propia y estable</w:t>
-      </w:r>
-    </w:p>
-    <w:p>
-      <w:pPr>
-        <w:spacing w:after="80"/>
-      </w:pPr>
-      <w:r>
-        <w:rPr>
-          <w:sz w:val="21"/>
-          <w:szCs w:val="21"/>
-        </w:rPr>
-        <w:t xml:space="preserve">El PDF o el ZIP se sube y queda con una URL fija que no cambie nunca. Si mañana se reemplaza el archivo, se reemplaza en esa misma URL — porque esa dirección va a quedar escrita en correos, en DMs y en comentarios que siguen vivos meses después.</w:t>
-      </w:r>
-    </w:p>
-    <w:p>
-      <w:pPr>
-        <w:spacing w:after="80"/>
-        <w:rPr>
-          <w:b/>
-          <w:bCs/>
-        </w:rPr>
-      </w:pPr>
-      <w:r>
-        <w:rPr>
-          <w:b/>
-          <w:bCs/>
-          <w:sz w:val="21"/>
-          <w:szCs w:val="21"/>
-        </w:rPr>
-        <w:t xml:space="preserve">2. Embudo de dos páginas</w:t>
-      </w:r>
-    </w:p>
-    <w:p>
-      <w:pPr>
-        <w:spacing w:after="80"/>
-      </w:pPr>
-      <w:r>
-        <w:rPr>
-          <w:sz w:val="21"/>
-          <w:szCs w:val="21"/>
-        </w:rPr>
-        <w:t xml:space="preserve">Página 1: la captura, con el formulario a la vista sin tener que bajar. Página 2: gracias, y ahí mismo el BOTÓN DE DESCARGA. El acceso es inmediato en pantalla. Nunca poner «te lo enviamos por correo» si no existe un workflow que lo envíe: es la promesa que más rápido se rompe.</w:t>
-      </w:r>
-    </w:p>
-    <w:p>
-      <w:pPr>
-        <w:spacing w:after="80"/>
-        <w:rPr>
-          <w:b/>
-          <w:bCs/>
-        </w:rPr>
-      </w:pPr>
-      <w:r>
-        <w:rPr>
-          <w:b/>
-          <w:bCs/>
-          <w:sz w:val="21"/>
-          <w:szCs w:val="21"/>
-        </w:rPr>
-        <w:t xml:space="preserve">3. Formulario nativo de GHL, no de terceros</w:t>
-      </w:r>
-    </w:p>
-    <w:p>
-      <w:pPr>
-        <w:spacing w:after="80"/>
-      </w:pPr>
-      <w:r>
-        <w:rPr>
-          <w:sz w:val="21"/>
-          <w:szCs w:val="21"/>
-        </w:rPr>
-        <w:t xml:space="preserve">Nombre, correo, WhatsApp y una pregunta de perfil («¿en qué trabajas hoy?»). El formulario nativo mete el contacto directo al CRM sin costo por ejecución; el Inbound Webhook es prémium y cobra por cada envío. Al terminar, redirección automática a la página 2.</w:t>
-      </w:r>
-    </w:p>
-    <w:p>
-      <w:pPr>
-        <w:spacing w:after="80"/>
-        <w:rPr>
-          <w:b/>
-          <w:bCs/>
-        </w:rPr>
-      </w:pPr>
-      <w:r>
-        <w:rPr>
-          <w:b/>
-          <w:bCs/>
-          <w:sz w:val="21"/>
-          <w:szCs w:val="21"/>
-        </w:rPr>
-        <w:t xml:space="preserve">4. Etiquetas desde el primer segundo</w:t>
-      </w:r>
-    </w:p>
-    <w:p>
-      <w:pPr>
-        <w:spacing w:after="80"/>
-      </w:pPr>
-      <w:r>
-        <w:rPr>
-          <w:sz w:val="21"/>
-          <w:szCs w:val="21"/>
-        </w:rPr>
-        <w:t xml:space="preserve">Cada contacto entra con dos etiquetas: una de tema (lead-revit-ia, lead-dynamo, lead-memoria-calculo) y una de origen (origen-bot-GUIA, origen-form, origen-comunidad). Sin la etiqueta de origen, a fin de mes no se puede decir qué recurso trajo a quién, y la pregunta de si el lead magnet sirvió se queda sin respuesta.</w:t>
-      </w:r>
-    </w:p>
-    <w:p>
-      <w:pPr>
-        <w:spacing w:after="80"/>
-        <w:rPr>
-          <w:b/>
-          <w:bCs/>
-        </w:rPr>
-      </w:pPr>
-      <w:r>
-        <w:rPr>
-          <w:b/>
-          <w:bCs/>
-          <w:sz w:val="21"/>
-          <w:szCs w:val="21"/>
-        </w:rPr>
-        <w:t xml:space="preserve">5. Bot de palabra clave en Instagram y Facebook — DOS ramas separadas</w:t>
-      </w:r>
-    </w:p>
-    <w:p>
-      <w:pPr>
-        <w:spacing w:after="80"/>
-      </w:pPr>
-      <w:r>
-        <w:rPr>
-          <w:sz w:val="21"/>
-          <w:szCs w:val="21"/>
-        </w:rPr>
-        <w:t xml:space="preserve">Disparador de comentario filtrado por la palabra clave → respuesta pública → DM con el enlace. La acción de envío se configura POR SEPARADO para cada red: rama Instagram con DM de Instagram, rama Facebook con DM de Messenger. Nunca una sola acción compartida.</w:t>
-      </w:r>
-    </w:p>
-    <w:p>
-      <w:pPr>
-        <w:spacing w:after="80"/>
-        <w:rPr>
-          <w:b/>
-          <w:bCs/>
-        </w:rPr>
-      </w:pPr>
-      <w:r>
-        <w:rPr>
-          <w:b/>
-          <w:bCs/>
-          <w:sz w:val="21"/>
-          <w:szCs w:val="21"/>
-        </w:rPr>
-        <w:t xml:space="preserve">6. La respuesta pública lleva SIEMPRE el enlace</w:t>
-      </w:r>
-    </w:p>
-    <w:p>
-      <w:pPr>
-        <w:spacing w:after="80"/>
-      </w:pPr>
-      <w:r>
-        <w:rPr>
-          <w:sz w:val="21"/>
-          <w:szCs w:val="21"/>
-        </w:rPr>
-        <w:t xml:space="preserve">No «te escribí al DM». El enlace visible en el comentario es la red de seguridad real: si el DM falla, la persona igual llega. Es gratis ponerlo y es lo único que salva la pieza cuando el canal falla en silencio.</w:t>
-      </w:r>
-    </w:p>
-    <w:p>
-      <w:pPr>
-        <w:spacing w:after="80"/>
-        <w:rPr>
-          <w:b/>
-          <w:bCs/>
-        </w:rPr>
-      </w:pPr>
-      <w:r>
-        <w:rPr>
-          <w:b/>
-          <w:bCs/>
-          <w:sz w:val="21"/>
-          <w:szCs w:val="21"/>
-        </w:rPr>
-        <w:t xml:space="preserve">7. Secuencia de correos, tres toques</w:t>
-      </w:r>
-    </w:p>
-    <w:p>
-      <w:pPr>
-        <w:spacing w:after="80"/>
-      </w:pPr>
-      <w:r>
-        <w:rPr>
-          <w:sz w:val="21"/>
-          <w:szCs w:val="21"/>
-        </w:rPr>
-        <w:t xml:space="preserve">Correo 1 inmediato con el enlace otra vez (la gente cierra la página de gracias sin descargar). Correo 2 a las 48 h con un uso concreto del recurso. Correo 3 al día 5 con el puente al programa que le corresponde. La secuencia se enciende con la etiqueta de tema, no a mano.</w:t>
-      </w:r>
-    </w:p>
-    <w:p>
-      <w:pPr>
-        <w:spacing w:after="80"/>
-        <w:rPr>
-          <w:b/>
-          <w:bCs/>
-        </w:rPr>
-      </w:pPr>
-      <w:r>
-        <w:rPr>
-          <w:b/>
-          <w:bCs/>
-          <w:sz w:val="21"/>
-          <w:szCs w:val="21"/>
-        </w:rPr>
-        <w:t xml:space="preserve">8. Notificación interna al equipo</w:t>
-      </w:r>
-    </w:p>
-    <w:p>
-      <w:pPr>
-        <w:spacing w:after="80"/>
-      </w:pPr>
-      <w:r>
-        <w:rPr>
-          <w:sz w:val="21"/>
-          <w:szCs w:val="21"/>
-        </w:rPr>
-        <w:t xml:space="preserve">Cada lead nuevo avisa al setter con el nombre del recurso y la respuesta de perfil. Un lead de memoria de cálculo no se trabaja igual que uno de Dynamo, y esa diferencia se pierde si todos caen en la misma bandeja sin etiqueta.</w:t>
-      </w:r>
-    </w:p>
-    <w:p>
-      <w:pPr>
-        <w:spacing w:after="80"/>
-        <w:rPr>
-          <w:b/>
-          <w:bCs/>
-        </w:rPr>
-      </w:pPr>
-      <w:r>
-        <w:rPr>
-          <w:b/>
-          <w:bCs/>
-          <w:sz w:val="21"/>
-          <w:szCs w:val="21"/>
-        </w:rPr>
-        <w:t xml:space="preserve">9. Prueba de punta a punta ANTES de publicar el post</w:t>
-      </w:r>
-    </w:p>
-    <w:p>
-      <w:pPr>
-        <w:spacing w:after="80"/>
-      </w:pPr>
-      <w:r>
-        <w:rPr>
-          <w:sz w:val="21"/>
-          <w:szCs w:val="21"/>
-        </w:rPr>
-        <w:t xml:space="preserve">La prueba se hace comentando la palabra en Instagram Y en la copia de Facebook del mismo post. Es la única forma de detectar la falla de abajo antes de que la vean 3.000 personas.</w:t>
-      </w:r>
-    </w:p>
-    <w:p>
-      <w:pPr>
-        <w:spacing w:after="80"/>
-        <w:rPr>
-          <w:color w:val="A33B2A"/>
-        </w:rPr>
-      </w:pPr>
-      <w:r>
-        <w:rPr>
-          <w:color w:val="A33B2A"/>
-          <w:sz w:val="21"/>
-          <w:szCs w:val="21"/>
-        </w:rPr>
-        <w:t xml:space="preserve">El DM que falla en silencio — julio de 2026, unos 35 leads perdidos. Cuando el post nace en Instagram y aparece también en Facebook, mucha gente comenta en la copia de Facebook. Si la acción «enviar DM» está atada solo al canal de Instagram, el envío falla y el workflow igual marca el paso como ejecutado: el ID de quien comentó es de Facebook, no de Instagram. La respuesta pública sí sale siempre, y por eso nadie se da cuenta. Se arregla con los pasos 5, 6 y 9 — los tres, no uno.</w:t>
-      </w:r>
-    </w:p>
-    <w:p>
-      <w:pPr>
-        <w:spacing w:after="100" w:before="280"/>
-      </w:pPr>
-      <w:r>
-        <w:rPr>
-          <w:b/>
-          <w:bCs/>
-          <w:color w:val="C96A1C"/>
-          <w:sz w:val="26"/>
-          <w:szCs w:val="26"/>
-        </w:rPr>
-        <w:t xml:space="preserve">Prueba de punta a punta antes de publicar</w:t>
-      </w:r>
-    </w:p>
-    <w:p>
-      <w:pPr>
-        <w:spacing w:after="80"/>
-      </w:pPr>
-      <w:r>
-        <w:rPr>
-          <w:sz w:val="21"/>
-          <w:szCs w:val="21"/>
-        </w:rPr>
-        <w:t xml:space="preserve">☐  Comentar la palabra clave en Instagram → llega el DM con el enlace.</w:t>
-      </w:r>
-    </w:p>
-    <w:p>
-      <w:pPr>
-        <w:spacing w:after="80"/>
-      </w:pPr>
-      <w:r>
-        <w:rPr>
-          <w:sz w:val="21"/>
-          <w:szCs w:val="21"/>
-        </w:rPr>
-        <w:t xml:space="preserve">☐  Comentar la palabra clave en la copia de Facebook → llega el DM por Messenger.</w:t>
-      </w:r>
-    </w:p>
-    <w:p>
-      <w:pPr>
-        <w:spacing w:after="80"/>
-      </w:pPr>
-      <w:r>
-        <w:rPr>
-          <w:sz w:val="21"/>
-          <w:szCs w:val="21"/>
-        </w:rPr>
-        <w:t xml:space="preserve">☐  La respuesta pública automática incluye el enlace visible.</w:t>
-      </w:r>
-    </w:p>
-    <w:p>
-      <w:pPr>
-        <w:spacing w:after="80"/>
-      </w:pPr>
-      <w:r>
-        <w:rPr>
-          <w:sz w:val="21"/>
-          <w:szCs w:val="21"/>
-        </w:rPr>
-        <w:t xml:space="preserve">☐  El enlace abre la página de captura en teléfono, no solo en computador.</w:t>
-      </w:r>
-    </w:p>
-    <w:p>
-      <w:pPr>
-        <w:spacing w:after="80"/>
-      </w:pPr>
-      <w:r>
-        <w:rPr>
-          <w:sz w:val="21"/>
-          <w:szCs w:val="21"/>
-        </w:rPr>
-        <w:t xml:space="preserve">☐  Enviar el formulario → redirige solo a la página de gracias.</w:t>
-      </w:r>
-    </w:p>
-    <w:p>
-      <w:pPr>
-        <w:spacing w:after="80"/>
-      </w:pPr>
-      <w:r>
-        <w:rPr>
-          <w:sz w:val="21"/>
-          <w:szCs w:val="21"/>
-        </w:rPr>
-        <w:t xml:space="preserve">☐  El botón de descarga de la página de gracias entrega el archivo correcto.</w:t>
-      </w:r>
-    </w:p>
-    <w:p>
-      <w:pPr>
-        <w:spacing w:after="80"/>
-      </w:pPr>
-      <w:r>
-        <w:rPr>
-          <w:sz w:val="21"/>
-          <w:szCs w:val="21"/>
-        </w:rPr>
-        <w:t xml:space="preserve">☐  El contacto aparece en el CRM con sus dos etiquetas.</w:t>
-      </w:r>
-    </w:p>
-    <w:p>
-      <w:pPr>
-        <w:spacing w:after="80"/>
-      </w:pPr>
-      <w:r>
-        <w:rPr>
-          <w:sz w:val="21"/>
-          <w:szCs w:val="21"/>
-        </w:rPr>
-        <w:t xml:space="preserve">☐  Llega el correo 1 con el enlace.</w:t>
-      </w:r>
-    </w:p>
-    <w:p>
-      <w:pPr>
-        <w:spacing w:after="80"/>
-      </w:pPr>
-      <w:r>
-        <w:rPr>
-          <w:sz w:val="21"/>
-          <w:szCs w:val="21"/>
-        </w:rPr>
-        <w:t xml:space="preserve">☐  El setter recibe la notificación con el nombre del recurso.</w:t>
-      </w:r>
-    </w:p>
-    <w:p>
-      <w:pPr>
-        <w:spacing w:after="80"/>
-      </w:pPr>
-      <w:r>
-        <w:rPr>
-          <w:sz w:val="21"/>
-          <w:szCs w:val="21"/>
-        </w:rPr>
-        <w:t xml:space="preserve">☐  Borrar los contactos de prueba antes de publicar.</w:t>
-      </w:r>
-    </w:p>
-    <w:p>
-      <w:r>
-        <w:br w:type="page"/>
-      </w:r>
-    </w:p>
-    <w:p>
-      <w:pPr>
-        <w:pStyle w:val="Heading1"/>
-        <w:spacing w:after="140" w:before="360"/>
+        <w:t xml:space="preserve">texto final se monta en Canva: la IA entrega el fondo y los elementos, no las letras.</w:t>
+      </w:r>
+    </w:p>
+    <w:p>
+      <w:pPr>
+        <w:spacing w:after="80" w:before="200"/>
       </w:pPr>
       <w:r>
         <w:rPr>
           <w:b/>
           <w:bCs/>
           <w:color w:val="0E2438"/>
-        </w:rPr>
-        <w:t xml:space="preserve">6 · GRUPO 1 · Feed principal — Instagram + Facebook + TikTok + YouTube Shorts</w:t>
+          <w:sz w:val="22"/>
+          <w:szCs w:val="22"/>
+        </w:rPr>
+        <w:t xml:space="preserve">Post de lanzamiento · Jue 1 oct · POST PLANO (1 imagen) — EXTRA de lanzamiento</w:t>
       </w:r>
     </w:p>
     <w:p>
@@ -27034,7 +28080,881 @@
           <w:sz w:val="21"/>
           <w:szCs w:val="21"/>
         </w:rPr>
-        <w:t xml:space="preserve">El mismo contenido adaptado a cada red del grupo (YouTube Shorts SOLO recibe los reels). Publicacion lunes, miercoles y viernes. TODO es contenido NUEVO: los reels grabados en agosto que nunca se publicaron quedan fuera (decision de Dayana, 2-sep). Mezcla: 40% reels · 40% carruseles · 20% post plano.</w:t>
+        <w:t xml:space="preserve">Redes: Instagram + Facebook</w:t>
+      </w:r>
+    </w:p>
+    <w:p>
+      <w:pPr>
+        <w:pBdr>
+          <w:left w:val="single" w:color="C96A1C" w:sz="18" w:space="8"/>
+        </w:pBdr>
+        <w:shd w:fill="F4F7FA" w:val="clear"/>
+        <w:spacing w:after="100"/>
+      </w:pPr>
+      <w:r>
+        <w:rPr>
+          <w:i/>
+          <w:iCs/>
+          <w:color w:val="5A6B7B"/>
+          <w:sz w:val="20"/>
+          <w:szCs w:val="20"/>
+        </w:rPr>
+        <w:t xml:space="preserve">Segunda pieza del mismo recurso, dos días después del reel. Va en post plano porque cumple la regla de la casa: lleva dato de cálculo verificable. Cierra el mes y deja la palabra MEMORIA pedida una vez más antes de octubre.</w:t>
+      </w:r>
+    </w:p>
+    <w:p>
+      <w:pPr>
+        <w:pBdr>
+          <w:left w:val="single" w:color="B9C6D3" w:sz="14" w:space="8"/>
+        </w:pBdr>
+        <w:shd w:fill="F7F9FB" w:val="clear"/>
+        <w:spacing w:after="140"/>
+      </w:pPr>
+      <w:r>
+        <w:rPr>
+          <w:rFonts w:ascii="Consolas" w:cs="Consolas" w:eastAsia="Consolas" w:hAnsi="Consolas"/>
+          <w:sz w:val="18"/>
+          <w:szCs w:val="18"/>
+        </w:rPr>
+        <w:t xml:space="preserve">Una memoria de cálculo no se devuelve por los números. Se devuelve por lo que no está escrito.</w:t>
+      </w:r>
+    </w:p>
+    <w:p>
+      <w:pPr>
+        <w:pBdr>
+          <w:left w:val="single" w:color="B9C6D3" w:sz="14" w:space="8"/>
+        </w:pBdr>
+        <w:shd w:fill="F7F9FB" w:val="clear"/>
+        <w:spacing w:after="0"/>
+      </w:pPr>
+      <w:r>
+        <w:rPr>
+          <w:rFonts w:ascii="Consolas" w:cs="Consolas" w:eastAsia="Consolas" w:hAnsi="Consolas"/>
+          <w:sz w:val="18"/>
+          <w:szCs w:val="18"/>
+        </w:rPr>
+        <w:t xml:space="preserve">Hipótesis que no se declararon. Criterios que se adoptaron y no se justificaron. Normativa</w:t>
+      </w:r>
+    </w:p>
+    <w:p>
+      <w:pPr>
+        <w:pBdr>
+          <w:left w:val="single" w:color="B9C6D3" w:sz="14" w:space="8"/>
+        </w:pBdr>
+        <w:shd w:fill="F7F9FB" w:val="clear"/>
+        <w:spacing w:after="0"/>
+      </w:pPr>
+      <w:r>
+        <w:rPr>
+          <w:rFonts w:ascii="Consolas" w:cs="Consolas" w:eastAsia="Consolas" w:hAnsi="Consolas"/>
+          <w:sz w:val="18"/>
+          <w:szCs w:val="18"/>
+        </w:rPr>
+        <w:t xml:space="preserve">citada sin versión.</w:t>
+      </w:r>
+    </w:p>
+    <w:p>
+      <w:pPr>
+        <w:pBdr>
+          <w:left w:val="single" w:color="B9C6D3" w:sz="14" w:space="8"/>
+        </w:pBdr>
+        <w:shd w:fill="F7F9FB" w:val="clear"/>
+        <w:spacing w:after="0"/>
+      </w:pPr>
+      <w:r>
+        <w:rPr>
+          <w:rFonts w:ascii="Consolas" w:cs="Consolas" w:eastAsia="Consolas" w:hAnsi="Consolas"/>
+          <w:sz w:val="18"/>
+          <w:szCs w:val="18"/>
+        </w:rPr>
+        <w:t xml:space="preserve"> </w:t>
+      </w:r>
+    </w:p>
+    <w:p>
+      <w:pPr>
+        <w:pBdr>
+          <w:left w:val="single" w:color="B9C6D3" w:sz="14" w:space="8"/>
+        </w:pBdr>
+        <w:shd w:fill="F7F9FB" w:val="clear"/>
+        <w:spacing w:after="0"/>
+      </w:pPr>
+      <w:r>
+        <w:rPr>
+          <w:rFonts w:ascii="Consolas" w:cs="Consolas" w:eastAsia="Consolas" w:hAnsi="Consolas"/>
+          <w:sz w:val="18"/>
+          <w:szCs w:val="18"/>
+        </w:rPr>
+        <w:t xml:space="preserve">El cálculo estaba bien. El documento no lo demostraba.</w:t>
+      </w:r>
+    </w:p>
+    <w:p>
+      <w:pPr>
+        <w:pBdr>
+          <w:left w:val="single" w:color="B9C6D3" w:sz="14" w:space="8"/>
+        </w:pBdr>
+        <w:shd w:fill="F7F9FB" w:val="clear"/>
+        <w:spacing w:after="0"/>
+      </w:pPr>
+      <w:r>
+        <w:rPr>
+          <w:rFonts w:ascii="Consolas" w:cs="Consolas" w:eastAsia="Consolas" w:hAnsi="Consolas"/>
+          <w:sz w:val="18"/>
+          <w:szCs w:val="18"/>
+        </w:rPr>
+        <w:t xml:space="preserve"> </w:t>
+      </w:r>
+    </w:p>
+    <w:p>
+      <w:pPr>
+        <w:pBdr>
+          <w:left w:val="single" w:color="B9C6D3" w:sz="14" w:space="8"/>
+        </w:pBdr>
+        <w:shd w:fill="F7F9FB" w:val="clear"/>
+        <w:spacing w:after="0"/>
+      </w:pPr>
+      <w:r>
+        <w:rPr>
+          <w:rFonts w:ascii="Consolas" w:cs="Consolas" w:eastAsia="Consolas" w:hAnsi="Consolas"/>
+          <w:sz w:val="18"/>
+          <w:szCs w:val="18"/>
+        </w:rPr>
+        <w:t xml:space="preserve">Armamos la guía con la estructura completa de una memoria que se sostiene ante revisión, y la</w:t>
+      </w:r>
+    </w:p>
+    <w:p>
+      <w:pPr>
+        <w:pBdr>
+          <w:left w:val="single" w:color="B9C6D3" w:sz="14" w:space="8"/>
+        </w:pBdr>
+        <w:shd w:fill="F7F9FB" w:val="clear"/>
+        <w:spacing w:after="0"/>
+      </w:pPr>
+      <w:r>
+        <w:rPr>
+          <w:rFonts w:ascii="Consolas" w:cs="Consolas" w:eastAsia="Consolas" w:hAnsi="Consolas"/>
+          <w:sz w:val="18"/>
+          <w:szCs w:val="18"/>
+        </w:rPr>
+        <w:t xml:space="preserve">plantilla editable para llenarla.</w:t>
+      </w:r>
+    </w:p>
+    <w:p>
+      <w:pPr>
+        <w:pBdr>
+          <w:left w:val="single" w:color="B9C6D3" w:sz="14" w:space="8"/>
+        </w:pBdr>
+        <w:shd w:fill="F7F9FB" w:val="clear"/>
+        <w:spacing w:after="0"/>
+      </w:pPr>
+      <w:r>
+        <w:rPr>
+          <w:rFonts w:ascii="Consolas" w:cs="Consolas" w:eastAsia="Consolas" w:hAnsi="Consolas"/>
+          <w:sz w:val="18"/>
+          <w:szCs w:val="18"/>
+        </w:rPr>
+        <w:t xml:space="preserve"> </w:t>
+      </w:r>
+    </w:p>
+    <w:p>
+      <w:pPr>
+        <w:pBdr>
+          <w:left w:val="single" w:color="B9C6D3" w:sz="14" w:space="8"/>
+        </w:pBdr>
+        <w:shd w:fill="F7F9FB" w:val="clear"/>
+        <w:spacing w:after="0"/>
+      </w:pPr>
+      <w:r>
+        <w:rPr>
+          <w:rFonts w:ascii="Consolas" w:cs="Consolas" w:eastAsia="Consolas" w:hAnsi="Consolas"/>
+          <w:sz w:val="18"/>
+          <w:szCs w:val="18"/>
+        </w:rPr>
+        <w:t xml:space="preserve">Es gratis. Comenta MEMORIA y te llega.</w:t>
+      </w:r>
+    </w:p>
+    <w:p>
+      <w:pPr>
+        <w:pBdr>
+          <w:left w:val="single" w:color="B9C6D3" w:sz="14" w:space="8"/>
+        </w:pBdr>
+        <w:shd w:fill="F7F9FB" w:val="clear"/>
+        <w:spacing w:after="0"/>
+      </w:pPr>
+      <w:r>
+        <w:rPr>
+          <w:rFonts w:ascii="Consolas" w:cs="Consolas" w:eastAsia="Consolas" w:hAnsi="Consolas"/>
+          <w:sz w:val="18"/>
+          <w:szCs w:val="18"/>
+        </w:rPr>
+        <w:t xml:space="preserve"> </w:t>
+      </w:r>
+    </w:p>
+    <w:p>
+      <w:pPr>
+        <w:pBdr>
+          <w:left w:val="single" w:color="B9C6D3" w:sz="14" w:space="8"/>
+        </w:pBdr>
+        <w:shd w:fill="F7F9FB" w:val="clear"/>
+        <w:spacing w:after="140"/>
+      </w:pPr>
+      <w:r>
+        <w:rPr>
+          <w:rFonts w:ascii="Consolas" w:cs="Consolas" w:eastAsia="Consolas" w:hAnsi="Consolas"/>
+          <w:sz w:val="18"/>
+          <w:szCs w:val="18"/>
+        </w:rPr>
+        <w:t xml:space="preserve">¿Por qué te devolvieron la última que entregaste?</w:t>
+      </w:r>
+    </w:p>
+    <w:p>
+      <w:pPr>
+        <w:spacing w:after="80"/>
+        <w:rPr>
+          <w:b/>
+          <w:bCs/>
+        </w:rPr>
+      </w:pPr>
+      <w:r>
+        <w:rPr>
+          <w:b/>
+          <w:bCs/>
+          <w:sz w:val="21"/>
+          <w:szCs w:val="21"/>
+        </w:rPr>
+        <w:t xml:space="preserve">CTA: Comenta MEMORIA</w:t>
+      </w:r>
+    </w:p>
+    <w:p>
+      <w:pPr>
+        <w:spacing w:after="80"/>
+        <w:rPr>
+          <w:b/>
+          <w:bCs/>
+          <w:color w:val="5A6B7B"/>
+          <w:sz w:val="16"/>
+          <w:szCs w:val="16"/>
+        </w:rPr>
+      </w:pPr>
+      <w:r>
+        <w:rPr>
+          <w:b/>
+          <w:bCs/>
+          <w:color w:val="5A6B7B"/>
+          <w:sz w:val="16"/>
+          <w:szCs w:val="16"/>
+        </w:rPr>
+        <w:t xml:space="preserve">PROMPT DE IMAGEN</w:t>
+      </w:r>
+    </w:p>
+    <w:p>
+      <w:pPr>
+        <w:pBdr>
+          <w:left w:val="single" w:color="B9C6D3" w:sz="14" w:space="8"/>
+        </w:pBdr>
+        <w:shd w:fill="F4F7FA" w:val="clear"/>
+        <w:spacing w:after="0"/>
+      </w:pPr>
+      <w:r>
+        <w:rPr>
+          <w:rFonts w:ascii="Consolas" w:cs="Consolas" w:eastAsia="Consolas" w:hAnsi="Consolas"/>
+          <w:sz w:val="18"/>
+          <w:szCs w:val="18"/>
+        </w:rPr>
+        <w:t xml:space="preserve">Imagen 1080x1350 px (4:5). Fondo azul marino #0E2438. Un documento técnico visto de frente y en</w:t>
+      </w:r>
+    </w:p>
+    <w:p>
+      <w:pPr>
+        <w:pBdr>
+          <w:left w:val="single" w:color="B9C6D3" w:sz="14" w:space="8"/>
+        </w:pBdr>
+        <w:shd w:fill="F4F7FA" w:val="clear"/>
+        <w:spacing w:after="0"/>
+      </w:pPr>
+      <w:r>
+        <w:rPr>
+          <w:rFonts w:ascii="Consolas" w:cs="Consolas" w:eastAsia="Consolas" w:hAnsi="Consolas"/>
+          <w:sz w:val="18"/>
+          <w:szCs w:val="18"/>
+        </w:rPr>
+        <w:t xml:space="preserve">perspectiva muy leve, dibujado en línea fina ámbar #E8A04A, con la silueta de párrafos y una</w:t>
+      </w:r>
+    </w:p>
+    <w:p>
+      <w:pPr>
+        <w:pBdr>
+          <w:left w:val="single" w:color="B9C6D3" w:sz="14" w:space="8"/>
+        </w:pBdr>
+        <w:shd w:fill="F4F7FA" w:val="clear"/>
+        <w:spacing w:after="0"/>
+      </w:pPr>
+      <w:r>
+        <w:rPr>
+          <w:rFonts w:ascii="Consolas" w:cs="Consolas" w:eastAsia="Consolas" w:hAnsi="Consolas"/>
+          <w:sz w:val="18"/>
+          <w:szCs w:val="18"/>
+        </w:rPr>
+        <w:t xml:space="preserve">tabla — el texto ilegible a propósito. Dos de sus secciones aparecen vacías, marcadas con un</w:t>
+      </w:r>
+    </w:p>
+    <w:p>
+      <w:pPr>
+        <w:pBdr>
+          <w:left w:val="single" w:color="B9C6D3" w:sz="14" w:space="8"/>
+        </w:pBdr>
+        <w:shd w:fill="F4F7FA" w:val="clear"/>
+        <w:spacing w:after="0"/>
+      </w:pPr>
+      <w:r>
+        <w:rPr>
+          <w:rFonts w:ascii="Consolas" w:cs="Consolas" w:eastAsia="Consolas" w:hAnsi="Consolas"/>
+          <w:sz w:val="18"/>
+          <w:szCs w:val="18"/>
+        </w:rPr>
+        <w:t xml:space="preserve">recuadro ámbar más grueso, como huecos. Sobrio, nada de sellos rojos ni de gestos de rechazo.</w:t>
+      </w:r>
+    </w:p>
+    <w:p>
+      <w:pPr>
+        <w:pBdr>
+          <w:left w:val="single" w:color="B9C6D3" w:sz="14" w:space="8"/>
+        </w:pBdr>
+        <w:shd w:fill="F4F7FA" w:val="clear"/>
+        <w:spacing w:after="0"/>
+      </w:pPr>
+      <w:r>
+        <w:rPr>
+          <w:rFonts w:ascii="Consolas" w:cs="Consolas" w:eastAsia="Consolas" w:hAnsi="Consolas"/>
+          <w:sz w:val="18"/>
+          <w:szCs w:val="18"/>
+        </w:rPr>
+        <w:t xml:space="preserve">Estilo Design Modeling Academy: fondo azul marino #0E2438, acentos en ámbar #E8A04A, tipografía</w:t>
+      </w:r>
+    </w:p>
+    <w:p>
+      <w:pPr>
+        <w:pBdr>
+          <w:left w:val="single" w:color="B9C6D3" w:sz="14" w:space="8"/>
+        </w:pBdr>
+        <w:shd w:fill="F4F7FA" w:val="clear"/>
+        <w:spacing w:after="0"/>
+      </w:pPr>
+      <w:r>
+        <w:rPr>
+          <w:rFonts w:ascii="Consolas" w:cs="Consolas" w:eastAsia="Consolas" w:hAnsi="Consolas"/>
+          <w:sz w:val="18"/>
+          <w:szCs w:val="18"/>
+        </w:rPr>
+        <w:t xml:space="preserve">sans-serif de palo seco muy gruesa, composición limpia y con aire, sin stock corporativo ni</w:t>
+      </w:r>
+    </w:p>
+    <w:p>
+      <w:pPr>
+        <w:pBdr>
+          <w:left w:val="single" w:color="B9C6D3" w:sz="14" w:space="8"/>
+        </w:pBdr>
+        <w:shd w:fill="F4F7FA" w:val="clear"/>
+        <w:spacing w:after="0"/>
+      </w:pPr>
+      <w:r>
+        <w:rPr>
+          <w:rFonts w:ascii="Consolas" w:cs="Consolas" w:eastAsia="Consolas" w:hAnsi="Consolas"/>
+          <w:sz w:val="18"/>
+          <w:szCs w:val="18"/>
+        </w:rPr>
+        <w:t xml:space="preserve">gente sonriendo a cámara. El texto final se monta en Canva: la IA entrega el fondo y los</w:t>
+      </w:r>
+    </w:p>
+    <w:p>
+      <w:pPr>
+        <w:pBdr>
+          <w:left w:val="single" w:color="B9C6D3" w:sz="14" w:space="8"/>
+        </w:pBdr>
+        <w:shd w:fill="F4F7FA" w:val="clear"/>
+        <w:spacing w:after="140"/>
+      </w:pPr>
+      <w:r>
+        <w:rPr>
+          <w:rFonts w:ascii="Consolas" w:cs="Consolas" w:eastAsia="Consolas" w:hAnsi="Consolas"/>
+          <w:sz w:val="18"/>
+          <w:szCs w:val="18"/>
+        </w:rPr>
+        <w:t xml:space="preserve">elementos, no las letras.</w:t>
+      </w:r>
+    </w:p>
+    <w:p>
+      <w:pPr>
+        <w:spacing w:after="100" w:before="280"/>
+      </w:pPr>
+      <w:r>
+        <w:rPr>
+          <w:b/>
+          <w:bCs/>
+          <w:color w:val="C96A1C"/>
+          <w:sz w:val="26"/>
+          <w:szCs w:val="26"/>
+        </w:rPr>
+        <w:t xml:space="preserve">El montaje en GoHighLevel — el mismo para los tres</w:t>
+      </w:r>
+    </w:p>
+    <w:p>
+      <w:pPr>
+        <w:spacing w:after="80"/>
+        <w:rPr>
+          <w:b/>
+          <w:bCs/>
+        </w:rPr>
+      </w:pPr>
+      <w:r>
+        <w:rPr>
+          <w:b/>
+          <w:bCs/>
+          <w:sz w:val="21"/>
+          <w:szCs w:val="21"/>
+        </w:rPr>
+        <w:t xml:space="preserve">1. El archivo, con URL propia y estable</w:t>
+      </w:r>
+    </w:p>
+    <w:p>
+      <w:pPr>
+        <w:spacing w:after="80"/>
+      </w:pPr>
+      <w:r>
+        <w:rPr>
+          <w:sz w:val="21"/>
+          <w:szCs w:val="21"/>
+        </w:rPr>
+        <w:t xml:space="preserve">El PDF o el ZIP se sube y queda con una URL fija que no cambie nunca. Si mañana se reemplaza el archivo, se reemplaza en esa misma URL — porque esa dirección va a quedar escrita en correos, en DMs y en comentarios que siguen vivos meses después.</w:t>
+      </w:r>
+    </w:p>
+    <w:p>
+      <w:pPr>
+        <w:spacing w:after="80"/>
+        <w:rPr>
+          <w:b/>
+          <w:bCs/>
+        </w:rPr>
+      </w:pPr>
+      <w:r>
+        <w:rPr>
+          <w:b/>
+          <w:bCs/>
+          <w:sz w:val="21"/>
+          <w:szCs w:val="21"/>
+        </w:rPr>
+        <w:t xml:space="preserve">2. Embudo de dos páginas</w:t>
+      </w:r>
+    </w:p>
+    <w:p>
+      <w:pPr>
+        <w:spacing w:after="80"/>
+      </w:pPr>
+      <w:r>
+        <w:rPr>
+          <w:sz w:val="21"/>
+          <w:szCs w:val="21"/>
+        </w:rPr>
+        <w:t xml:space="preserve">Página 1: la captura, con el formulario a la vista sin tener que bajar. Página 2: gracias, y ahí mismo el BOTÓN DE DESCARGA. El acceso es inmediato en pantalla. Nunca poner «te lo enviamos por correo» si no existe un workflow que lo envíe: es la promesa que más rápido se rompe.</w:t>
+      </w:r>
+    </w:p>
+    <w:p>
+      <w:pPr>
+        <w:spacing w:after="80"/>
+        <w:rPr>
+          <w:b/>
+          <w:bCs/>
+        </w:rPr>
+      </w:pPr>
+      <w:r>
+        <w:rPr>
+          <w:b/>
+          <w:bCs/>
+          <w:sz w:val="21"/>
+          <w:szCs w:val="21"/>
+        </w:rPr>
+        <w:t xml:space="preserve">3. Formulario nativo de GHL, no de terceros</w:t>
+      </w:r>
+    </w:p>
+    <w:p>
+      <w:pPr>
+        <w:spacing w:after="80"/>
+      </w:pPr>
+      <w:r>
+        <w:rPr>
+          <w:sz w:val="21"/>
+          <w:szCs w:val="21"/>
+        </w:rPr>
+        <w:t xml:space="preserve">Nombre, correo, WhatsApp y una pregunta de perfil («¿en qué trabajas hoy?»). El formulario nativo mete el contacto directo al CRM sin costo por ejecución; el Inbound Webhook es prémium y cobra por cada envío. Al terminar, redirección automática a la página 2.</w:t>
+      </w:r>
+    </w:p>
+    <w:p>
+      <w:pPr>
+        <w:spacing w:after="80"/>
+        <w:rPr>
+          <w:b/>
+          <w:bCs/>
+        </w:rPr>
+      </w:pPr>
+      <w:r>
+        <w:rPr>
+          <w:b/>
+          <w:bCs/>
+          <w:sz w:val="21"/>
+          <w:szCs w:val="21"/>
+        </w:rPr>
+        <w:t xml:space="preserve">4. Etiquetas desde el primer segundo</w:t>
+      </w:r>
+    </w:p>
+    <w:p>
+      <w:pPr>
+        <w:spacing w:after="80"/>
+      </w:pPr>
+      <w:r>
+        <w:rPr>
+          <w:sz w:val="21"/>
+          <w:szCs w:val="21"/>
+        </w:rPr>
+        <w:t xml:space="preserve">Cada contacto entra con dos etiquetas: una de tema (lead-revit-ia, lead-dynamo, lead-memoria-calculo) y una de origen (origen-bot-GUIA, origen-form, origen-comunidad). Sin la etiqueta de origen, a fin de mes no se puede decir qué recurso trajo a quién, y la pregunta de si el lead magnet sirvió se queda sin respuesta.</w:t>
+      </w:r>
+    </w:p>
+    <w:p>
+      <w:pPr>
+        <w:spacing w:after="80"/>
+        <w:rPr>
+          <w:b/>
+          <w:bCs/>
+        </w:rPr>
+      </w:pPr>
+      <w:r>
+        <w:rPr>
+          <w:b/>
+          <w:bCs/>
+          <w:sz w:val="21"/>
+          <w:szCs w:val="21"/>
+        </w:rPr>
+        <w:t xml:space="preserve">5. Bot de palabra clave en Instagram y Facebook — DOS ramas separadas</w:t>
+      </w:r>
+    </w:p>
+    <w:p>
+      <w:pPr>
+        <w:spacing w:after="80"/>
+      </w:pPr>
+      <w:r>
+        <w:rPr>
+          <w:sz w:val="21"/>
+          <w:szCs w:val="21"/>
+        </w:rPr>
+        <w:t xml:space="preserve">Disparador de comentario filtrado por la palabra clave → respuesta pública → DM con el enlace. La acción de envío se configura POR SEPARADO para cada red: rama Instagram con DM de Instagram, rama Facebook con DM de Messenger. Nunca una sola acción compartida.</w:t>
+      </w:r>
+    </w:p>
+    <w:p>
+      <w:pPr>
+        <w:spacing w:after="80"/>
+        <w:rPr>
+          <w:b/>
+          <w:bCs/>
+        </w:rPr>
+      </w:pPr>
+      <w:r>
+        <w:rPr>
+          <w:b/>
+          <w:bCs/>
+          <w:sz w:val="21"/>
+          <w:szCs w:val="21"/>
+        </w:rPr>
+        <w:t xml:space="preserve">6. La respuesta pública lleva SIEMPRE el enlace</w:t>
+      </w:r>
+    </w:p>
+    <w:p>
+      <w:pPr>
+        <w:spacing w:after="80"/>
+      </w:pPr>
+      <w:r>
+        <w:rPr>
+          <w:sz w:val="21"/>
+          <w:szCs w:val="21"/>
+        </w:rPr>
+        <w:t xml:space="preserve">No «te escribí al DM». El enlace visible en el comentario es la red de seguridad real: si el DM falla, la persona igual llega. Es gratis ponerlo y es lo único que salva la pieza cuando el canal falla en silencio.</w:t>
+      </w:r>
+    </w:p>
+    <w:p>
+      <w:pPr>
+        <w:spacing w:after="80"/>
+        <w:rPr>
+          <w:b/>
+          <w:bCs/>
+        </w:rPr>
+      </w:pPr>
+      <w:r>
+        <w:rPr>
+          <w:b/>
+          <w:bCs/>
+          <w:sz w:val="21"/>
+          <w:szCs w:val="21"/>
+        </w:rPr>
+        <w:t xml:space="preserve">7. Secuencia de correos, tres toques</w:t>
+      </w:r>
+    </w:p>
+    <w:p>
+      <w:pPr>
+        <w:spacing w:after="80"/>
+      </w:pPr>
+      <w:r>
+        <w:rPr>
+          <w:sz w:val="21"/>
+          <w:szCs w:val="21"/>
+        </w:rPr>
+        <w:t xml:space="preserve">Correo 1 inmediato con el enlace otra vez (la gente cierra la página de gracias sin descargar). Correo 2 a las 48 h con un uso concreto del recurso. Correo 3 al día 5 con el puente al programa que le corresponde. La secuencia se enciende con la etiqueta de tema, no a mano.</w:t>
+      </w:r>
+    </w:p>
+    <w:p>
+      <w:pPr>
+        <w:spacing w:after="80"/>
+        <w:rPr>
+          <w:b/>
+          <w:bCs/>
+        </w:rPr>
+      </w:pPr>
+      <w:r>
+        <w:rPr>
+          <w:b/>
+          <w:bCs/>
+          <w:sz w:val="21"/>
+          <w:szCs w:val="21"/>
+        </w:rPr>
+        <w:t xml:space="preserve">8. Notificación interna al equipo</w:t>
+      </w:r>
+    </w:p>
+    <w:p>
+      <w:pPr>
+        <w:spacing w:after="80"/>
+      </w:pPr>
+      <w:r>
+        <w:rPr>
+          <w:sz w:val="21"/>
+          <w:szCs w:val="21"/>
+        </w:rPr>
+        <w:t xml:space="preserve">Cada lead nuevo avisa al setter con el nombre del recurso y la respuesta de perfil. Un lead de memoria de cálculo no se trabaja igual que uno de Dynamo, y esa diferencia se pierde si todos caen en la misma bandeja sin etiqueta.</w:t>
+      </w:r>
+    </w:p>
+    <w:p>
+      <w:pPr>
+        <w:spacing w:after="80"/>
+        <w:rPr>
+          <w:b/>
+          <w:bCs/>
+        </w:rPr>
+      </w:pPr>
+      <w:r>
+        <w:rPr>
+          <w:b/>
+          <w:bCs/>
+          <w:sz w:val="21"/>
+          <w:szCs w:val="21"/>
+        </w:rPr>
+        <w:t xml:space="preserve">9. Prueba de punta a punta ANTES de publicar el post</w:t>
+      </w:r>
+    </w:p>
+    <w:p>
+      <w:pPr>
+        <w:spacing w:after="80"/>
+      </w:pPr>
+      <w:r>
+        <w:rPr>
+          <w:sz w:val="21"/>
+          <w:szCs w:val="21"/>
+        </w:rPr>
+        <w:t xml:space="preserve">La prueba se hace comentando la palabra en Instagram Y en la copia de Facebook del mismo post. Es la única forma de detectar la falla de abajo antes de que la vean 3.000 personas.</w:t>
+      </w:r>
+    </w:p>
+    <w:p>
+      <w:pPr>
+        <w:spacing w:after="80"/>
+        <w:rPr>
+          <w:color w:val="A33B2A"/>
+        </w:rPr>
+      </w:pPr>
+      <w:r>
+        <w:rPr>
+          <w:color w:val="A33B2A"/>
+          <w:sz w:val="21"/>
+          <w:szCs w:val="21"/>
+        </w:rPr>
+        <w:t xml:space="preserve">El DM que falla en silencio — julio de 2026, unos 35 leads perdidos. Cuando el post nace en Instagram y aparece también en Facebook, mucha gente comenta en la copia de Facebook. Si la acción «enviar DM» está atada solo al canal de Instagram, el envío falla y el workflow igual marca el paso como ejecutado: el ID de quien comentó es de Facebook, no de Instagram. La respuesta pública sí sale siempre, y por eso nadie se da cuenta. Se arregla con los pasos 5, 6 y 9 — los tres, no uno.</w:t>
+      </w:r>
+    </w:p>
+    <w:p>
+      <w:pPr>
+        <w:spacing w:after="100" w:before="280"/>
+      </w:pPr>
+      <w:r>
+        <w:rPr>
+          <w:b/>
+          <w:bCs/>
+          <w:color w:val="C96A1C"/>
+          <w:sz w:val="26"/>
+          <w:szCs w:val="26"/>
+        </w:rPr>
+        <w:t xml:space="preserve">Prueba de punta a punta antes de publicar</w:t>
+      </w:r>
+    </w:p>
+    <w:p>
+      <w:pPr>
+        <w:spacing w:after="80"/>
+      </w:pPr>
+      <w:r>
+        <w:rPr>
+          <w:sz w:val="21"/>
+          <w:szCs w:val="21"/>
+        </w:rPr>
+        <w:t xml:space="preserve">☐  Comentar la palabra clave en Instagram → llega el DM con el enlace.</w:t>
+      </w:r>
+    </w:p>
+    <w:p>
+      <w:pPr>
+        <w:spacing w:after="80"/>
+      </w:pPr>
+      <w:r>
+        <w:rPr>
+          <w:sz w:val="21"/>
+          <w:szCs w:val="21"/>
+        </w:rPr>
+        <w:t xml:space="preserve">☐  Comentar la palabra clave en la copia de Facebook → llega el DM por Messenger.</w:t>
+      </w:r>
+    </w:p>
+    <w:p>
+      <w:pPr>
+        <w:spacing w:after="80"/>
+      </w:pPr>
+      <w:r>
+        <w:rPr>
+          <w:sz w:val="21"/>
+          <w:szCs w:val="21"/>
+        </w:rPr>
+        <w:t xml:space="preserve">☐  La respuesta pública automática incluye el enlace visible.</w:t>
+      </w:r>
+    </w:p>
+    <w:p>
+      <w:pPr>
+        <w:spacing w:after="80"/>
+      </w:pPr>
+      <w:r>
+        <w:rPr>
+          <w:sz w:val="21"/>
+          <w:szCs w:val="21"/>
+        </w:rPr>
+        <w:t xml:space="preserve">☐  El enlace abre la página de captura en teléfono, no solo en computador.</w:t>
+      </w:r>
+    </w:p>
+    <w:p>
+      <w:pPr>
+        <w:spacing w:after="80"/>
+      </w:pPr>
+      <w:r>
+        <w:rPr>
+          <w:sz w:val="21"/>
+          <w:szCs w:val="21"/>
+        </w:rPr>
+        <w:t xml:space="preserve">☐  Enviar el formulario → redirige solo a la página de gracias.</w:t>
+      </w:r>
+    </w:p>
+    <w:p>
+      <w:pPr>
+        <w:spacing w:after="80"/>
+      </w:pPr>
+      <w:r>
+        <w:rPr>
+          <w:sz w:val="21"/>
+          <w:szCs w:val="21"/>
+        </w:rPr>
+        <w:t xml:space="preserve">☐  El botón de descarga de la página de gracias entrega el archivo correcto.</w:t>
+      </w:r>
+    </w:p>
+    <w:p>
+      <w:pPr>
+        <w:spacing w:after="80"/>
+      </w:pPr>
+      <w:r>
+        <w:rPr>
+          <w:sz w:val="21"/>
+          <w:szCs w:val="21"/>
+        </w:rPr>
+        <w:t xml:space="preserve">☐  El contacto aparece en el CRM con sus dos etiquetas.</w:t>
+      </w:r>
+    </w:p>
+    <w:p>
+      <w:pPr>
+        <w:spacing w:after="80"/>
+      </w:pPr>
+      <w:r>
+        <w:rPr>
+          <w:sz w:val="21"/>
+          <w:szCs w:val="21"/>
+        </w:rPr>
+        <w:t xml:space="preserve">☐  Llega el correo 1 con el enlace.</w:t>
+      </w:r>
+    </w:p>
+    <w:p>
+      <w:pPr>
+        <w:spacing w:after="80"/>
+      </w:pPr>
+      <w:r>
+        <w:rPr>
+          <w:sz w:val="21"/>
+          <w:szCs w:val="21"/>
+        </w:rPr>
+        <w:t xml:space="preserve">☐  El setter recibe la notificación con el nombre del recurso.</w:t>
+      </w:r>
+    </w:p>
+    <w:p>
+      <w:pPr>
+        <w:spacing w:after="80"/>
+      </w:pPr>
+      <w:r>
+        <w:rPr>
+          <w:sz w:val="21"/>
+          <w:szCs w:val="21"/>
+        </w:rPr>
+        <w:t xml:space="preserve">☐  Borrar los contactos de prueba antes de publicar.</w:t>
+      </w:r>
+    </w:p>
+    <w:p>
+      <w:r>
+        <w:br w:type="page"/>
+      </w:r>
+    </w:p>
+    <w:p>
+      <w:pPr>
+        <w:pStyle w:val="Heading1"/>
+        <w:spacing w:after="140" w:before="360"/>
+      </w:pPr>
+      <w:r>
+        <w:rPr>
+          <w:b/>
+          <w:bCs/>
+          <w:color w:val="0E2438"/>
+        </w:rPr>
+        <w:t xml:space="preserve">6 · GRUPO 1 · Feed principal — Instagram + Facebook + TikTok + YouTube Shorts</w:t>
+      </w:r>
+    </w:p>
+    <w:p>
+      <w:pPr>
+        <w:spacing w:after="80"/>
+        <w:rPr>
+          <w:i/>
+          <w:iCs/>
+          <w:color w:val="5A6B7B"/>
+        </w:rPr>
+      </w:pPr>
+      <w:r>
+        <w:rPr>
+          <w:i/>
+          <w:iCs/>
+          <w:color w:val="5A6B7B"/>
+          <w:sz w:val="21"/>
+          <w:szCs w:val="21"/>
+        </w:rPr>
+        <w:t xml:space="preserve">El mismo contenido adaptado a cada red del grupo (YouTube Shorts SOLO recibe los reels). Publicacion base lunes, miercoles y viernes. Encima van las 6 piezas de lead magnet: el reel los martes 8, 22 y 29 y el carrusel o post plano los jueves 10, 24 y 1 de octubre. Esas seis son ADICIONALES: no ocupan ninguno de los doce huecos base. TODO es contenido NUEVO: los reels grabados en agosto que nunca se publicaron quedan fuera (decision de Dayana, 2-sep). Mezcla: 40% reels · 40% carruseles · 20% post plano.</w:t>
       </w:r>
     </w:p>
     <w:p>
@@ -27400,7 +29320,7 @@
                 <w:sz w:val="18"/>
                 <w:szCs w:val="18"/>
               </w:rPr>
-              <w:t xml:space="preserve">Vie 11</w:t>
+              <w:t xml:space="preserve">Jue 10</w:t>
             </w:r>
           </w:p>
         </w:tc>
@@ -27414,7 +29334,7 @@
                 <w:sz w:val="18"/>
                 <w:szCs w:val="18"/>
               </w:rPr>
-              <w:t xml:space="preserve">POST PLANO (1 imagen)</w:t>
+              <w:t xml:space="preserve">CARRUSEL (7 slides) — EXTRA lanzamiento de recurso</w:t>
             </w:r>
           </w:p>
         </w:tc>
@@ -27428,7 +29348,7 @@
                 <w:sz w:val="18"/>
                 <w:szCs w:val="18"/>
               </w:rPr>
-              <w:t xml:space="preserve">🎯 valor</w:t>
+              <w:t xml:space="preserve">lanzamiento-recurso</w:t>
             </w:r>
           </w:p>
         </w:tc>
@@ -27442,7 +29362,7 @@
                 <w:sz w:val="18"/>
                 <w:szCs w:val="18"/>
               </w:rPr>
-              <w:t xml:space="preserve">Dato de cálculo: la cuantía mínima de una columna</w:t>
+              <w:t xml:space="preserve">⚠️ SIN GUION: lm-revit-chatgpt-feed</w:t>
             </w:r>
           </w:p>
         </w:tc>
@@ -27458,7 +29378,7 @@
                 <w:sz w:val="18"/>
                 <w:szCs w:val="18"/>
               </w:rPr>
-              <w:t xml:space="preserve">Lun 14</w:t>
+              <w:t xml:space="preserve">Vie 11</w:t>
             </w:r>
           </w:p>
         </w:tc>
@@ -27472,7 +29392,7 @@
                 <w:sz w:val="18"/>
                 <w:szCs w:val="18"/>
               </w:rPr>
-              <w:t xml:space="preserve">CARRUSEL (7 slides)</w:t>
+              <w:t xml:space="preserve">POST PLANO (1 imagen)</w:t>
             </w:r>
           </w:p>
         </w:tc>
@@ -27500,7 +29420,7 @@
                 <w:sz w:val="18"/>
                 <w:szCs w:val="18"/>
               </w:rPr>
-              <w:t xml:space="preserve">Mejores prácticas para la coordinación en Navisworks</w:t>
+              <w:t xml:space="preserve">Dato de cálculo: la cuantía mínima de una columna</w:t>
             </w:r>
           </w:p>
         </w:tc>
@@ -27516,7 +29436,7 @@
                 <w:sz w:val="18"/>
                 <w:szCs w:val="18"/>
               </w:rPr>
-              <w:t xml:space="preserve">Mie 16</w:t>
+              <w:t xml:space="preserve">Lun 14</w:t>
             </w:r>
           </w:p>
         </w:tc>
@@ -27530,7 +29450,7 @@
                 <w:sz w:val="18"/>
                 <w:szCs w:val="18"/>
               </w:rPr>
-              <w:t xml:space="preserve">REEL (grabar)</w:t>
+              <w:t xml:space="preserve">CARRUSEL (7 slides)</w:t>
             </w:r>
           </w:p>
         </w:tc>
@@ -27558,7 +29478,7 @@
                 <w:sz w:val="18"/>
                 <w:szCs w:val="18"/>
               </w:rPr>
-              <w:t xml:space="preserve">⚠️ SIN GUION: reel-duplicados</w:t>
+              <w:t xml:space="preserve">Mejores prácticas para la coordinación en Navisworks</w:t>
             </w:r>
           </w:p>
         </w:tc>
@@ -27574,7 +29494,7 @@
                 <w:sz w:val="18"/>
                 <w:szCs w:val="18"/>
               </w:rPr>
-              <w:t xml:space="preserve">Vie 18</w:t>
+              <w:t xml:space="preserve">Mie 16</w:t>
             </w:r>
           </w:p>
         </w:tc>
@@ -27616,7 +29536,7 @@
                 <w:sz w:val="18"/>
                 <w:szCs w:val="18"/>
               </w:rPr>
-              <w:t xml:space="preserve">⚠️ SIN GUION: reel-advertencias</w:t>
+              <w:t xml:space="preserve">⚠️ SIN GUION: reel-duplicados</w:t>
             </w:r>
           </w:p>
         </w:tc>
@@ -27632,7 +29552,7 @@
                 <w:sz w:val="18"/>
                 <w:szCs w:val="18"/>
               </w:rPr>
-              <w:t xml:space="preserve">Lun 21</w:t>
+              <w:t xml:space="preserve">Vie 18</w:t>
             </w:r>
           </w:p>
         </w:tc>
@@ -27646,7 +29566,7 @@
                 <w:sz w:val="18"/>
                 <w:szCs w:val="18"/>
               </w:rPr>
-              <w:t xml:space="preserve">CARRUSEL (8 slides)</w:t>
+              <w:t xml:space="preserve">REEL (grabar)</w:t>
             </w:r>
           </w:p>
         </w:tc>
@@ -27674,7 +29594,7 @@
                 <w:sz w:val="18"/>
                 <w:szCs w:val="18"/>
               </w:rPr>
-              <w:t xml:space="preserve">Errores comunes al modelar en Revit y cómo evitarlos</w:t>
+              <w:t xml:space="preserve">⚠️ SIN GUION: reel-advertencias</w:t>
             </w:r>
           </w:p>
         </w:tc>
@@ -27690,7 +29610,7 @@
                 <w:sz w:val="18"/>
                 <w:szCs w:val="18"/>
               </w:rPr>
-              <w:t xml:space="preserve">Mar 22</w:t>
+              <w:t xml:space="preserve">Lun 21</w:t>
             </w:r>
           </w:p>
         </w:tc>
@@ -27704,7 +29624,7 @@
                 <w:sz w:val="18"/>
                 <w:szCs w:val="18"/>
               </w:rPr>
-              <w:t xml:space="preserve">REEL (grabar) — EXTRA lanzamiento de recurso</w:t>
+              <w:t xml:space="preserve">CARRUSEL (8 slides)</w:t>
             </w:r>
           </w:p>
         </w:tc>
@@ -27718,7 +29638,7 @@
                 <w:sz w:val="18"/>
                 <w:szCs w:val="18"/>
               </w:rPr>
-              <w:t xml:space="preserve">lanzamiento-recurso</w:t>
+              <w:t xml:space="preserve">🎯 valor</w:t>
             </w:r>
           </w:p>
         </w:tc>
@@ -27732,7 +29652,7 @@
                 <w:sz w:val="18"/>
                 <w:szCs w:val="18"/>
               </w:rPr>
-              <w:t xml:space="preserve">⚠️ SIN GUION: pauta-dynamo</w:t>
+              <w:t xml:space="preserve">Errores comunes al modelar en Revit y cómo evitarlos</w:t>
             </w:r>
           </w:p>
         </w:tc>
@@ -27748,7 +29668,7 @@
                 <w:sz w:val="18"/>
                 <w:szCs w:val="18"/>
               </w:rPr>
-              <w:t xml:space="preserve">Mie 23</w:t>
+              <w:t xml:space="preserve">Mar 22</w:t>
             </w:r>
           </w:p>
         </w:tc>
@@ -27762,7 +29682,7 @@
                 <w:sz w:val="18"/>
                 <w:szCs w:val="18"/>
               </w:rPr>
-              <w:t xml:space="preserve">CARRUSEL (8 slides)</w:t>
+              <w:t xml:space="preserve">REEL (grabar) — EXTRA lanzamiento de recurso</w:t>
             </w:r>
           </w:p>
         </w:tc>
@@ -27776,7 +29696,7 @@
                 <w:sz w:val="18"/>
                 <w:szCs w:val="18"/>
               </w:rPr>
-              <w:t xml:space="preserve">💰 venta</w:t>
+              <w:t xml:space="preserve">lanzamiento-recurso</w:t>
             </w:r>
           </w:p>
         </w:tc>
@@ -27790,7 +29710,7 @@
                 <w:sz w:val="18"/>
                 <w:szCs w:val="18"/>
               </w:rPr>
-              <w:t xml:space="preserve">Las 4 puertas: ¿en qué etapa BIM estás?</w:t>
+              <w:t xml:space="preserve">⚠️ SIN GUION: pauta-dynamo</w:t>
             </w:r>
           </w:p>
         </w:tc>
@@ -27806,7 +29726,7 @@
                 <w:sz w:val="18"/>
                 <w:szCs w:val="18"/>
               </w:rPr>
-              <w:t xml:space="preserve">Vie 25</w:t>
+              <w:t xml:space="preserve">Mie 23</w:t>
             </w:r>
           </w:p>
         </w:tc>
@@ -27820,7 +29740,7 @@
                 <w:sz w:val="18"/>
                 <w:szCs w:val="18"/>
               </w:rPr>
-              <w:t xml:space="preserve">REEL (grabar)</w:t>
+              <w:t xml:space="preserve">CARRUSEL (8 slides)</w:t>
             </w:r>
           </w:p>
         </w:tc>
@@ -27834,7 +29754,7 @@
                 <w:sz w:val="18"/>
                 <w:szCs w:val="18"/>
               </w:rPr>
-              <w:t xml:space="preserve">🎯 valor</w:t>
+              <w:t xml:space="preserve">💰 venta</w:t>
             </w:r>
           </w:p>
         </w:tc>
@@ -27848,7 +29768,7 @@
                 <w:sz w:val="18"/>
                 <w:szCs w:val="18"/>
               </w:rPr>
-              <w:t xml:space="preserve">⚠️ SIN GUION: reel-cita-norma</w:t>
+              <w:t xml:space="preserve">Las 4 puertas: ¿en qué etapa BIM estás?</w:t>
             </w:r>
           </w:p>
         </w:tc>
@@ -27864,7 +29784,7 @@
                 <w:sz w:val="18"/>
                 <w:szCs w:val="18"/>
               </w:rPr>
-              <w:t xml:space="preserve">Lun 28</w:t>
+              <w:t xml:space="preserve">Jue 24</w:t>
             </w:r>
           </w:p>
         </w:tc>
@@ -27878,7 +29798,7 @@
                 <w:sz w:val="18"/>
                 <w:szCs w:val="18"/>
               </w:rPr>
-              <w:t xml:space="preserve">CARRUSEL (6 slides)</w:t>
+              <w:t xml:space="preserve">CARRUSEL (6 slides) — EXTRA lanzamiento de recurso</w:t>
             </w:r>
           </w:p>
         </w:tc>
@@ -27892,7 +29812,7 @@
                 <w:sz w:val="18"/>
                 <w:szCs w:val="18"/>
               </w:rPr>
-              <w:t xml:space="preserve">💰 venta</w:t>
+              <w:t xml:space="preserve">lanzamiento-recurso</w:t>
             </w:r>
           </w:p>
         </w:tc>
@@ -27906,7 +29826,7 @@
                 <w:sz w:val="18"/>
                 <w:szCs w:val="18"/>
               </w:rPr>
-              <w:t xml:space="preserve">ACERO ahora responde: el tutor de IA de la Especialización</w:t>
+              <w:t xml:space="preserve">⚠️ SIN GUION: lm-dynamo-python-feed</w:t>
             </w:r>
           </w:p>
         </w:tc>
@@ -27922,7 +29842,7 @@
                 <w:sz w:val="18"/>
                 <w:szCs w:val="18"/>
               </w:rPr>
-              <w:t xml:space="preserve">Mar 29</w:t>
+              <w:t xml:space="preserve">Vie 25</w:t>
             </w:r>
           </w:p>
         </w:tc>
@@ -27936,7 +29856,7 @@
                 <w:sz w:val="18"/>
                 <w:szCs w:val="18"/>
               </w:rPr>
-              <w:t xml:space="preserve">REEL (grabar) — EXTRA lanzamiento de recurso</w:t>
+              <w:t xml:space="preserve">REEL (grabar)</w:t>
             </w:r>
           </w:p>
         </w:tc>
@@ -27950,7 +29870,7 @@
                 <w:sz w:val="18"/>
                 <w:szCs w:val="18"/>
               </w:rPr>
-              <w:t xml:space="preserve">lanzamiento-recurso</w:t>
+              <w:t xml:space="preserve">🎯 valor</w:t>
             </w:r>
           </w:p>
         </w:tc>
@@ -27964,7 +29884,7 @@
                 <w:sz w:val="18"/>
                 <w:szCs w:val="18"/>
               </w:rPr>
-              <w:t xml:space="preserve">⚠️ SIN GUION: pauta-memoria</w:t>
+              <w:t xml:space="preserve">⚠️ SIN GUION: reel-cita-norma</w:t>
             </w:r>
           </w:p>
         </w:tc>
@@ -27980,6 +29900,122 @@
                 <w:sz w:val="18"/>
                 <w:szCs w:val="18"/>
               </w:rPr>
+              <w:t xml:space="preserve">Lun 28</w:t>
+            </w:r>
+          </w:p>
+        </w:tc>
+        <w:tc>
+          <w:tcPr>
+            <w:tcW w:type="dxa" w:w="2300"/>
+          </w:tcPr>
+          <w:p>
+            <w:r>
+              <w:rPr>
+                <w:sz w:val="18"/>
+                <w:szCs w:val="18"/>
+              </w:rPr>
+              <w:t xml:space="preserve">CARRUSEL (6 slides)</w:t>
+            </w:r>
+          </w:p>
+        </w:tc>
+        <w:tc>
+          <w:tcPr>
+            <w:tcW w:type="dxa" w:w="1400"/>
+          </w:tcPr>
+          <w:p>
+            <w:r>
+              <w:rPr>
+                <w:sz w:val="18"/>
+                <w:szCs w:val="18"/>
+              </w:rPr>
+              <w:t xml:space="preserve">💰 venta</w:t>
+            </w:r>
+          </w:p>
+        </w:tc>
+        <w:tc>
+          <w:tcPr>
+            <w:tcW w:type="dxa" w:w="6100"/>
+          </w:tcPr>
+          <w:p>
+            <w:r>
+              <w:rPr>
+                <w:sz w:val="18"/>
+                <w:szCs w:val="18"/>
+              </w:rPr>
+              <w:t xml:space="preserve">ACERO ahora responde: el tutor de IA de la Especialización</w:t>
+            </w:r>
+          </w:p>
+        </w:tc>
+      </w:tr>
+      <w:tr>
+        <w:tc>
+          <w:tcPr>
+            <w:tcW w:type="dxa" w:w="1600"/>
+          </w:tcPr>
+          <w:p>
+            <w:r>
+              <w:rPr>
+                <w:sz w:val="18"/>
+                <w:szCs w:val="18"/>
+              </w:rPr>
+              <w:t xml:space="preserve">Mar 29</w:t>
+            </w:r>
+          </w:p>
+        </w:tc>
+        <w:tc>
+          <w:tcPr>
+            <w:tcW w:type="dxa" w:w="2300"/>
+          </w:tcPr>
+          <w:p>
+            <w:r>
+              <w:rPr>
+                <w:sz w:val="18"/>
+                <w:szCs w:val="18"/>
+              </w:rPr>
+              <w:t xml:space="preserve">REEL (grabar) — EXTRA lanzamiento de recurso</w:t>
+            </w:r>
+          </w:p>
+        </w:tc>
+        <w:tc>
+          <w:tcPr>
+            <w:tcW w:type="dxa" w:w="1400"/>
+          </w:tcPr>
+          <w:p>
+            <w:r>
+              <w:rPr>
+                <w:sz w:val="18"/>
+                <w:szCs w:val="18"/>
+              </w:rPr>
+              <w:t xml:space="preserve">lanzamiento-recurso</w:t>
+            </w:r>
+          </w:p>
+        </w:tc>
+        <w:tc>
+          <w:tcPr>
+            <w:tcW w:type="dxa" w:w="6100"/>
+          </w:tcPr>
+          <w:p>
+            <w:r>
+              <w:rPr>
+                <w:sz w:val="18"/>
+                <w:szCs w:val="18"/>
+              </w:rPr>
+              <w:t xml:space="preserve">⚠️ SIN GUION: pauta-memoria</w:t>
+            </w:r>
+          </w:p>
+        </w:tc>
+      </w:tr>
+      <w:tr>
+        <w:tc>
+          <w:tcPr>
+            <w:tcW w:type="dxa" w:w="1600"/>
+          </w:tcPr>
+          <w:p>
+            <w:r>
+              <w:rPr>
+                <w:sz w:val="18"/>
+                <w:szCs w:val="18"/>
+              </w:rPr>
               <w:t xml:space="preserve">Mie 30</w:t>
             </w:r>
           </w:p>
@@ -28023,6 +30059,64 @@
                 <w:szCs w:val="18"/>
               </w:rPr>
               <w:t xml:space="preserve">⚠️ SIN GUION: reel-limite-ia</w:t>
+            </w:r>
+          </w:p>
+        </w:tc>
+      </w:tr>
+      <w:tr>
+        <w:tc>
+          <w:tcPr>
+            <w:tcW w:type="dxa" w:w="1600"/>
+          </w:tcPr>
+          <w:p>
+            <w:r>
+              <w:rPr>
+                <w:sz w:val="18"/>
+                <w:szCs w:val="18"/>
+              </w:rPr>
+              <w:t xml:space="preserve">Jue 1 oct</w:t>
+            </w:r>
+          </w:p>
+        </w:tc>
+        <w:tc>
+          <w:tcPr>
+            <w:tcW w:type="dxa" w:w="2300"/>
+          </w:tcPr>
+          <w:p>
+            <w:r>
+              <w:rPr>
+                <w:sz w:val="18"/>
+                <w:szCs w:val="18"/>
+              </w:rPr>
+              <w:t xml:space="preserve">POST PLANO (1 imagen) — EXTRA lanzamiento de recurso</w:t>
+            </w:r>
+          </w:p>
+        </w:tc>
+        <w:tc>
+          <w:tcPr>
+            <w:tcW w:type="dxa" w:w="1400"/>
+          </w:tcPr>
+          <w:p>
+            <w:r>
+              <w:rPr>
+                <w:sz w:val="18"/>
+                <w:szCs w:val="18"/>
+              </w:rPr>
+              <w:t xml:space="preserve">lanzamiento-recurso</w:t>
+            </w:r>
+          </w:p>
+        </w:tc>
+        <w:tc>
+          <w:tcPr>
+            <w:tcW w:type="dxa" w:w="6100"/>
+          </w:tcPr>
+          <w:p>
+            <w:r>
+              <w:rPr>
+                <w:sz w:val="18"/>
+                <w:szCs w:val="18"/>
+              </w:rPr>
+              <w:t xml:space="preserve">⚠️ SIN GUION: lm-memoria-calculo-feed</w:t>
             </w:r>
           </w:p>
         </w:tc>
@@ -29273,6 +31367,65 @@
           <w:szCs w:val="21"/>
         </w:rPr>
         <w:t xml:space="preserve">Formato previsto: REEL (grabar) · Redes: (las del grupo)</w:t>
+      </w:r>
+    </w:p>
+    <w:p>
+      <w:pPr>
+        <w:pBdr>
+          <w:bottom w:val="single" w:color="C96A1C" w:sz="12" w:space="6"/>
+        </w:pBdr>
+        <w:spacing w:after="60" w:before="340"/>
+      </w:pPr>
+      <w:r>
+        <w:rPr>
+          <w:b/>
+          <w:bCs/>
+          <w:color w:val="C96A1C"/>
+          <w:sz w:val="24"/>
+          <w:szCs w:val="24"/>
+        </w:rPr>
+        <w:t xml:space="preserve">Jue 10  ·  </w:t>
+      </w:r>
+      <w:r>
+        <w:rPr>
+          <w:b/>
+          <w:bCs/>
+          <w:color w:val="0E2438"/>
+          <w:sz w:val="24"/>
+          <w:szCs w:val="24"/>
+        </w:rPr>
+        <w:t xml:space="preserve">(pendiente de definir)</w:t>
+      </w:r>
+    </w:p>
+    <w:p>
+      <w:pPr>
+        <w:pBdr>
+          <w:left w:val="single" w:color="C96A1C" w:sz="18" w:space="8"/>
+        </w:pBdr>
+        <w:shd w:fill="F4F7FA" w:val="clear"/>
+        <w:spacing w:after="100"/>
+      </w:pPr>
+      <w:r>
+        <w:rPr>
+          <w:i/>
+          <w:iCs/>
+          <w:color w:val="5A6B7B"/>
+          <w:sz w:val="20"/>
+          <w:szCs w:val="20"/>
+        </w:rPr>
+        <w:t xml:space="preserve">Segunda pieza del mismo recurso, dos dias despues del reel del Mar 8. El reel da alcance y el carrusel da guardados: un error de Revit se guarda para cuando vuelva a pasar. Los cinco que salen estan sacados de la guia YA PUBLICADA, no inventados. Desarrollo, slides y prompt en la pestaña Lead magnets.</w:t>
+      </w:r>
+    </w:p>
+    <w:p>
+      <w:pPr>
+        <w:spacing w:after="80"/>
+      </w:pPr>
+      <w:r>
+        <w:rPr>
+          <w:sz w:val="21"/>
+          <w:szCs w:val="21"/>
+        </w:rPr>
+        <w:t xml:space="preserve">Formato previsto: CARRUSEL (7 slides) — EXTRA lanzamiento de recurso · Redes: (las del grupo)</w:t>
       </w:r>
     </w:p>
     <w:p>
@@ -34484,6 +36637,65 @@
           <w:sz w:val="24"/>
           <w:szCs w:val="24"/>
         </w:rPr>
+        <w:t xml:space="preserve">Jue 24  ·  </w:t>
+      </w:r>
+      <w:r>
+        <w:rPr>
+          <w:b/>
+          <w:bCs/>
+          <w:color w:val="0E2438"/>
+          <w:sz w:val="24"/>
+          <w:szCs w:val="24"/>
+        </w:rPr>
+        <w:t xml:space="preserve">(pendiente de definir)</w:t>
+      </w:r>
+    </w:p>
+    <w:p>
+      <w:pPr>
+        <w:pBdr>
+          <w:left w:val="single" w:color="C96A1C" w:sz="18" w:space="8"/>
+        </w:pBdr>
+        <w:shd w:fill="F4F7FA" w:val="clear"/>
+        <w:spacing w:after="100"/>
+      </w:pPr>
+      <w:r>
+        <w:rPr>
+          <w:i/>
+          <w:iCs/>
+          <w:color w:val="5A6B7B"/>
+          <w:sz w:val="20"/>
+          <w:szCs w:val="20"/>
+        </w:rPr>
+        <w:t xml:space="preserve">Segunda pieza del mismo recurso, dos dias despues del reel del Mar 22. Dynamo es el tema de mejor guardado de la cuenta y el carrusel es el formato que mas se guarda. Cada slide es uno de los 5 scripts del pack. Desarrollo, slides y prompt en la pestaña Lead magnets.</w:t>
+      </w:r>
+    </w:p>
+    <w:p>
+      <w:pPr>
+        <w:spacing w:after="80"/>
+      </w:pPr>
+      <w:r>
+        <w:rPr>
+          <w:sz w:val="21"/>
+          <w:szCs w:val="21"/>
+        </w:rPr>
+        <w:t xml:space="preserve">Formato previsto: CARRUSEL (6 slides) — EXTRA lanzamiento de recurso · Redes: (las del grupo)</w:t>
+      </w:r>
+    </w:p>
+    <w:p>
+      <w:pPr>
+        <w:pBdr>
+          <w:bottom w:val="single" w:color="C96A1C" w:sz="12" w:space="6"/>
+        </w:pBdr>
+        <w:spacing w:after="60" w:before="340"/>
+      </w:pPr>
+      <w:r>
+        <w:rPr>
+          <w:b/>
+          <w:bCs/>
+          <w:color w:val="C96A1C"/>
+          <w:sz w:val="24"/>
+          <w:szCs w:val="24"/>
+        </w:rPr>
         <w:t xml:space="preserve">Vie 25  ·  </w:t>
       </w:r>
       <w:r>
@@ -36699,6 +38911,65 @@
           <w:szCs w:val="21"/>
         </w:rPr>
         <w:t xml:space="preserve">Formato previsto: REEL (grabar) · Redes: (las del grupo)</w:t>
+      </w:r>
+    </w:p>
+    <w:p>
+      <w:pPr>
+        <w:pBdr>
+          <w:bottom w:val="single" w:color="C96A1C" w:sz="12" w:space="6"/>
+        </w:pBdr>
+        <w:spacing w:after="60" w:before="340"/>
+      </w:pPr>
+      <w:r>
+        <w:rPr>
+          <w:b/>
+          <w:bCs/>
+          <w:color w:val="C96A1C"/>
+          <w:sz w:val="24"/>
+          <w:szCs w:val="24"/>
+        </w:rPr>
+        <w:t xml:space="preserve">Jue 1 oct  ·  </w:t>
+      </w:r>
+      <w:r>
+        <w:rPr>
+          <w:b/>
+          <w:bCs/>
+          <w:color w:val="0E2438"/>
+          <w:sz w:val="24"/>
+          <w:szCs w:val="24"/>
+        </w:rPr>
+        <w:t xml:space="preserve">(pendiente de definir)</w:t>
+      </w:r>
+    </w:p>
+    <w:p>
+      <w:pPr>
+        <w:pBdr>
+          <w:left w:val="single" w:color="C96A1C" w:sz="18" w:space="8"/>
+        </w:pBdr>
+        <w:shd w:fill="F4F7FA" w:val="clear"/>
+        <w:spacing w:after="100"/>
+      </w:pPr>
+      <w:r>
+        <w:rPr>
+          <w:i/>
+          <w:iCs/>
+          <w:color w:val="5A6B7B"/>
+          <w:sz w:val="20"/>
+          <w:szCs w:val="20"/>
+        </w:rPr>
+        <w:t xml:space="preserve">Segunda pieza del mismo recurso, dos dias despues del reel del Mar 29. Va en post plano porque cumple la regla de la casa: lleva dato de calculo verificable. Cierra el mes pidiendo MEMORIA una vez mas. Desarrollo y prompt en la pestaña Lead magnets.</w:t>
+      </w:r>
+    </w:p>
+    <w:p>
+      <w:pPr>
+        <w:spacing w:after="80"/>
+      </w:pPr>
+      <w:r>
+        <w:rPr>
+          <w:sz w:val="21"/>
+          <w:szCs w:val="21"/>
+        </w:rPr>
+        <w:t xml:space="preserve">Formato previsto: POST PLANO (1 imagen) — EXTRA lanzamiento de recurso · Redes: (las del grupo)</w:t>
       </w:r>
     </w:p>
     <w:p>
@@ -52045,7 +54316,7 @@
                 <w:sz w:val="18"/>
                 <w:szCs w:val="18"/>
               </w:rPr>
-              <w:t xml:space="preserve">5</w:t>
+              <w:t xml:space="preserve">7</w:t>
             </w:r>
           </w:p>
         </w:tc>
@@ -52105,7 +54376,7 @@
                 <w:sz w:val="18"/>
                 <w:szCs w:val="18"/>
               </w:rPr>
-              <w:t xml:space="preserve">2</w:t>
+              <w:t xml:space="preserve">3</w:t>
             </w:r>
           </w:p>
         </w:tc>
@@ -52120,10 +54391,10 @@
           <w:sz w:val="21"/>
           <w:szCs w:val="21"/>
         </w:rPr>
-        <w:t xml:space="preserve">El mes por grupos: 12 piezas base de feed (5 reels · 5 carruseles · 2 posts planos = 40/40/20) + 3 reels EXTRA de lanzamiento de recurso los martes 8, 22 y 29 + 12 mensajes de comunidades (Ma-Ju-Vi) + 4 blogs de sabado + 20 publicaciones de LinkedIn (L-V, 3 paginas) + historias diarias L-V con la venta los jueves + 4 correos + el paquete de publicidad de las 2 campañas que se sube completo el 7-sep. Todos los grupos cuentan la misma historia semanal adaptada a su canal.
-EL MES TIENE 14 REELS EN TOTAL: 5 de valor + 3 de lead magnet + 6 de venta (4 del Master y 2 de ACERO). Ocho salen en el feed; los seis de venta son creativos de campaña y no se publican en organico.
+        <w:t xml:space="preserve">El mes por grupos: 12 piezas base de feed (5 reels · 5 carruseles · 2 posts planos = 40/40/20) + 6 piezas EXTRA de lead magnet (un reel el martes y un carrusel o post plano el jueves, por cada uno de los tres recursos) + 12 mensajes de comunidades (Ma-Ju-Vi) + 4 blogs de sabado + 20 publicaciones de LinkedIn (L-V, 3 paginas) + historias diarias L-V con la venta los jueves + 4 correos + el paquete de publicidad de las 2 campañas que se sube completo el 7-sep. En total 18 piezas de feed. Todos los grupos cuentan la misma historia semanal adaptada a su canal.
+EL MES TIENE 14 REELS: 5 de valor + 3 de lead magnet + 6 de venta (4 del Master y 2 de ACERO). Ocho salen en el feed; los seis de venta son creativos de campaña y no se publican en organico.
 CAMBIO DEL 1-SEP: la campaña del Master pasa a venta POR MODULOS (4 anuncios nuevos con precio y formulario, mas el de diagnostico y el de la ruta). El BIM Level Test es ahora el calificador del setter. ACERO suma el tutor de IA en pauta y en el bot de Olympus.
-CAMBIO DEL 9-SEP: se completo el inventario de reels a 14. Los 4 del Master ya existian con guion pero solo se veian dentro de la pestaña de publicidad; de ACERO habia uno y se escribio el segundo. Los 3 lanzamientos de recurso pasaron a reel.</w:t>
+CAMBIO DEL 9-SEP: inventario de reels completado a 14, y cada lead magnet pasa a llevar DOS piezas de feed en vez de una — el reel y el carrusel o post plano — las dos adicionales a las 12 base.</w:t>
       </w:r>
     </w:p>
     <w:p>

</xml_diff>